<commit_message>
Realizando o mapa da empatia e mudando sobre a empresa
</commit_message>
<xml_diff>
--- a/Docs/Documentação OneHelp.docx
+++ b/Docs/Documentação OneHelp.docx
@@ -1526,7 +1526,7 @@
                 <w:noProof/>
                 <w:webHidden/>
               </w:rPr>
-              <w:t>6</w:t>
+              <w:t>5</w:t>
             </w:r>
             <w:r>
               <w:rPr>
@@ -1664,7 +1664,7 @@
                 <w:noProof/>
                 <w:webHidden/>
               </w:rPr>
-              <w:t>7</w:t>
+              <w:t>9</w:t>
             </w:r>
             <w:r>
               <w:rPr>
@@ -1733,7 +1733,7 @@
                 <w:noProof/>
                 <w:webHidden/>
               </w:rPr>
-              <w:t>8</w:t>
+              <w:t>9</w:t>
             </w:r>
             <w:r>
               <w:rPr>
@@ -1802,7 +1802,7 @@
                 <w:noProof/>
                 <w:webHidden/>
               </w:rPr>
-              <w:t>8</w:t>
+              <w:t>9</w:t>
             </w:r>
             <w:r>
               <w:rPr>
@@ -1887,7 +1887,7 @@
                 <w:noProof/>
                 <w:webHidden/>
               </w:rPr>
-              <w:t>8</w:t>
+              <w:t>9</w:t>
             </w:r>
             <w:r>
               <w:rPr>
@@ -1981,7 +1981,7 @@
                 <w:noProof/>
                 <w:webHidden/>
               </w:rPr>
-              <w:t>9</w:t>
+              <w:t>10</w:t>
             </w:r>
             <w:r>
               <w:rPr>
@@ -2066,7 +2066,7 @@
                 <w:noProof/>
                 <w:webHidden/>
               </w:rPr>
-              <w:t>9</w:t>
+              <w:t>10</w:t>
             </w:r>
             <w:r>
               <w:rPr>
@@ -2144,7 +2144,7 @@
                 <w:noProof/>
                 <w:webHidden/>
               </w:rPr>
-              <w:t>10</w:t>
+              <w:t>11</w:t>
             </w:r>
             <w:r>
               <w:rPr>
@@ -2213,7 +2213,7 @@
                 <w:noProof/>
                 <w:webHidden/>
               </w:rPr>
-              <w:t>10</w:t>
+              <w:t>11</w:t>
             </w:r>
             <w:r>
               <w:rPr>
@@ -2297,7 +2297,7 @@
                 <w:noProof/>
                 <w:webHidden/>
               </w:rPr>
-              <w:t>10</w:t>
+              <w:t>12</w:t>
             </w:r>
             <w:r>
               <w:rPr>
@@ -2381,7 +2381,7 @@
                 <w:noProof/>
                 <w:webHidden/>
               </w:rPr>
-              <w:t>10</w:t>
+              <w:t>12</w:t>
             </w:r>
             <w:r>
               <w:rPr>
@@ -2465,7 +2465,7 @@
                 <w:noProof/>
                 <w:webHidden/>
               </w:rPr>
-              <w:t>11</w:t>
+              <w:t>12</w:t>
             </w:r>
             <w:r>
               <w:rPr>
@@ -2549,7 +2549,7 @@
                 <w:noProof/>
                 <w:webHidden/>
               </w:rPr>
-              <w:t>11</w:t>
+              <w:t>12</w:t>
             </w:r>
             <w:r>
               <w:rPr>
@@ -2633,7 +2633,7 @@
                 <w:noProof/>
                 <w:webHidden/>
               </w:rPr>
-              <w:t>11</w:t>
+              <w:t>12</w:t>
             </w:r>
             <w:r>
               <w:rPr>
@@ -2676,21 +2676,7 @@
                 <w:rStyle w:val="Hyperlink"/>
                 <w:noProof/>
               </w:rPr>
-              <w:t>API REST e Comunic</w:t>
-            </w:r>
-            <w:r>
-              <w:rPr>
-                <w:rStyle w:val="Hyperlink"/>
-                <w:noProof/>
-              </w:rPr>
-              <w:t>a</w:t>
-            </w:r>
-            <w:r>
-              <w:rPr>
-                <w:rStyle w:val="Hyperlink"/>
-                <w:noProof/>
-              </w:rPr>
-              <w:t>ção com o Frontend e Backend</w:t>
+              <w:t>API REST e Comunicação com o Frontend e Backend</w:t>
             </w:r>
             <w:r>
               <w:rPr>
@@ -2731,7 +2717,7 @@
                 <w:noProof/>
                 <w:webHidden/>
               </w:rPr>
-              <w:t>11</w:t>
+              <w:t>12</w:t>
             </w:r>
             <w:r>
               <w:rPr>
@@ -2815,7 +2801,7 @@
                 <w:noProof/>
                 <w:webHidden/>
               </w:rPr>
-              <w:t>11</w:t>
+              <w:t>12</w:t>
             </w:r>
             <w:r>
               <w:rPr>
@@ -2899,7 +2885,7 @@
                 <w:noProof/>
                 <w:webHidden/>
               </w:rPr>
-              <w:t>11</w:t>
+              <w:t>12</w:t>
             </w:r>
             <w:r>
               <w:rPr>
@@ -2983,7 +2969,7 @@
                 <w:noProof/>
                 <w:webHidden/>
               </w:rPr>
-              <w:t>11</w:t>
+              <w:t>12</w:t>
             </w:r>
             <w:r>
               <w:rPr>
@@ -3067,7 +3053,7 @@
                 <w:noProof/>
                 <w:webHidden/>
               </w:rPr>
-              <w:t>11</w:t>
+              <w:t>12</w:t>
             </w:r>
             <w:r>
               <w:rPr>
@@ -3151,7 +3137,7 @@
                 <w:noProof/>
                 <w:webHidden/>
               </w:rPr>
-              <w:t>11</w:t>
+              <w:t>13</w:t>
             </w:r>
             <w:r>
               <w:rPr>
@@ -3235,7 +3221,7 @@
                 <w:noProof/>
                 <w:webHidden/>
               </w:rPr>
-              <w:t>11</w:t>
+              <w:t>13</w:t>
             </w:r>
             <w:r>
               <w:rPr>
@@ -3319,7 +3305,7 @@
                 <w:noProof/>
                 <w:webHidden/>
               </w:rPr>
-              <w:t>12</w:t>
+              <w:t>13</w:t>
             </w:r>
             <w:r>
               <w:rPr>
@@ -3403,7 +3389,7 @@
                 <w:noProof/>
                 <w:webHidden/>
               </w:rPr>
-              <w:t>12</w:t>
+              <w:t>13</w:t>
             </w:r>
             <w:r>
               <w:rPr>
@@ -3472,7 +3458,7 @@
                 <w:noProof/>
                 <w:webHidden/>
               </w:rPr>
-              <w:t>12</w:t>
+              <w:t>13</w:t>
             </w:r>
             <w:r>
               <w:rPr>
@@ -3541,7 +3527,7 @@
                 <w:noProof/>
                 <w:webHidden/>
               </w:rPr>
-              <w:t>13</w:t>
+              <w:t>14</w:t>
             </w:r>
             <w:r>
               <w:rPr>
@@ -3610,7 +3596,7 @@
                 <w:noProof/>
                 <w:webHidden/>
               </w:rPr>
-              <w:t>13</w:t>
+              <w:t>15</w:t>
             </w:r>
             <w:r>
               <w:rPr>
@@ -3679,7 +3665,7 @@
                 <w:noProof/>
                 <w:webHidden/>
               </w:rPr>
-              <w:t>13</w:t>
+              <w:t>15</w:t>
             </w:r>
             <w:r>
               <w:rPr>
@@ -3840,163 +3826,175 @@
     </w:p>
     <w:p>
       <w:pPr>
-        <w:pStyle w:val="NormalWeb"/>
-        <w:spacing w:line="360" w:lineRule="auto"/>
-        <w:jc w:val="both"/>
-        <w:rPr>
-          <w:rFonts w:ascii="Arial" w:hAnsi="Arial" w:cs="Arial"/>
-        </w:rPr>
-      </w:pPr>
-      <w:r>
-        <w:rPr>
-          <w:rFonts w:ascii="Arial" w:hAnsi="Arial" w:cs="Arial"/>
-        </w:rPr>
-        <w:t xml:space="preserve">A empresa criada pela equipe recebeu o nome de </w:t>
-      </w:r>
-      <w:proofErr w:type="spellStart"/>
-      <w:r>
-        <w:rPr>
-          <w:rFonts w:ascii="Arial" w:hAnsi="Arial" w:cs="Arial"/>
-        </w:rPr>
-        <w:t>Draxen</w:t>
-      </w:r>
-      <w:proofErr w:type="spellEnd"/>
-      <w:r>
-        <w:rPr>
-          <w:rFonts w:ascii="Arial" w:hAnsi="Arial" w:cs="Arial"/>
-        </w:rPr>
-        <w:t xml:space="preserve"> Systems e tem como objetivo desenvolver soluções tecnológicas voltadas para causas sociais, com foco no apoio a instituições e projetos voluntários. A proposta da empresa é utilizar a tecnologia como ferramenta para melhorar a organização e a gestão dessas iniciativas, facilitando processos internos e ampliando o alcance das ações realizadas.</w:t>
-      </w:r>
-    </w:p>
-    <w:p>
-      <w:pPr>
-        <w:pStyle w:val="NormalWeb"/>
-        <w:spacing w:line="360" w:lineRule="auto"/>
-        <w:jc w:val="both"/>
-        <w:rPr>
-          <w:rFonts w:ascii="Arial" w:hAnsi="Arial" w:cs="Arial"/>
-        </w:rPr>
-      </w:pPr>
-      <w:r>
-        <w:rPr>
-          <w:rFonts w:ascii="Arial" w:hAnsi="Arial" w:cs="Arial"/>
-        </w:rPr>
-        <w:t xml:space="preserve">Dentro dessa proposta, foi desenvolvido o projeto </w:t>
-      </w:r>
-      <w:proofErr w:type="spellStart"/>
-      <w:r>
-        <w:rPr>
-          <w:rFonts w:ascii="Arial" w:hAnsi="Arial" w:cs="Arial"/>
-        </w:rPr>
-        <w:t>One</w:t>
-      </w:r>
-      <w:proofErr w:type="spellEnd"/>
-      <w:r>
-        <w:rPr>
-          <w:rFonts w:ascii="Arial" w:hAnsi="Arial" w:cs="Arial"/>
-        </w:rPr>
-        <w:t xml:space="preserve"> Help, um sistema destinado a ONGs que atuam no resgate, cuidado e adoção de animais. A plataforma foi pensada para auxiliar no gerenciamento de informações importantes da instituição, oferecendo maior controle e praticidade no dia a dia.</w:t>
-      </w:r>
-    </w:p>
-    <w:p>
-      <w:pPr>
-        <w:pStyle w:val="NormalWeb"/>
-        <w:spacing w:line="360" w:lineRule="auto"/>
-        <w:jc w:val="both"/>
-        <w:rPr>
-          <w:rFonts w:ascii="Arial" w:hAnsi="Arial" w:cs="Arial"/>
-        </w:rPr>
-      </w:pPr>
-      <w:r>
-        <w:rPr>
-          <w:rFonts w:ascii="Arial" w:hAnsi="Arial" w:cs="Arial"/>
-        </w:rPr>
-        <w:t>O sistema contará com o cadastro de animais disponíveis para adoção, permitindo o acompanhamento dos dados de cada animal e também o registro daqueles que já foram adotados. Além disso, haverá o cadastro de voluntários, reunindo informações necessárias para a participação e apoio nas atividades da ONG. Outra funcionalidade importante será a área de novidades, responsável pela publicação de notícias, campanhas e atualizações no site.</w:t>
-      </w:r>
-    </w:p>
-    <w:p>
-      <w:pPr>
-        <w:pStyle w:val="NormalWeb"/>
-        <w:spacing w:line="360" w:lineRule="auto"/>
-        <w:jc w:val="both"/>
-        <w:rPr>
-          <w:rFonts w:ascii="Arial" w:hAnsi="Arial" w:cs="Arial"/>
-        </w:rPr>
-      </w:pPr>
-      <w:r>
-        <w:rPr>
-          <w:rFonts w:ascii="Arial" w:hAnsi="Arial" w:cs="Arial"/>
-        </w:rPr>
-        <w:t>De acordo com o Guia SBOK (</w:t>
-      </w:r>
-      <w:proofErr w:type="spellStart"/>
-      <w:r>
-        <w:rPr>
-          <w:rFonts w:ascii="Arial" w:hAnsi="Arial" w:cs="Arial"/>
-        </w:rPr>
-        <w:t>SCRUMstudy</w:t>
-      </w:r>
-      <w:proofErr w:type="spellEnd"/>
-      <w:r>
-        <w:rPr>
-          <w:rFonts w:ascii="Arial" w:hAnsi="Arial" w:cs="Arial"/>
-        </w:rPr>
-        <w:t>, 2016), o desenvolvimento está sendo conduzido com base nos princípios do Scrum, utilizando uma abordagem ágil que prioriza colaboração, adaptação e entregas contínuas. O trabalho é organizado em etapas curtas, permitindo acompanhar o progresso do projeto e realizar ajustes sempre que necessário.</w:t>
-      </w:r>
-    </w:p>
-    <w:p>
-      <w:pPr>
-        <w:pStyle w:val="NormalWeb"/>
-        <w:spacing w:line="360" w:lineRule="auto"/>
-        <w:jc w:val="both"/>
-        <w:rPr>
-          <w:rFonts w:ascii="Arial" w:hAnsi="Arial" w:cs="Arial"/>
-        </w:rPr>
-      </w:pPr>
-      <w:r>
-        <w:rPr>
-          <w:rFonts w:ascii="Arial" w:hAnsi="Arial" w:cs="Arial"/>
-        </w:rPr>
-        <w:t xml:space="preserve">Essa metodologia contribui para maior eficiência no desenvolvimento, melhor comunicação entre os membros da equipe e mais qualidade no produto final. Assim, a </w:t>
-      </w:r>
-      <w:proofErr w:type="spellStart"/>
-      <w:r>
-        <w:rPr>
-          <w:rFonts w:ascii="Arial" w:hAnsi="Arial" w:cs="Arial"/>
-        </w:rPr>
-        <w:t>Draxen</w:t>
-      </w:r>
-      <w:proofErr w:type="spellEnd"/>
-      <w:r>
-        <w:rPr>
-          <w:rFonts w:ascii="Arial" w:hAnsi="Arial" w:cs="Arial"/>
-        </w:rPr>
-        <w:t xml:space="preserve"> Systems busca entregar, com o </w:t>
-      </w:r>
-      <w:proofErr w:type="spellStart"/>
-      <w:r>
-        <w:rPr>
-          <w:rFonts w:ascii="Arial" w:hAnsi="Arial" w:cs="Arial"/>
-        </w:rPr>
-        <w:t>One</w:t>
-      </w:r>
-      <w:proofErr w:type="spellEnd"/>
-      <w:r>
-        <w:rPr>
-          <w:rFonts w:ascii="Arial" w:hAnsi="Arial" w:cs="Arial"/>
-        </w:rPr>
-        <w:t xml:space="preserve"> Help, uma solução prática e funcional que possa apoiar ONGs de proteção animal e fortalecer ações de adoção e voluntariado.</w:t>
-      </w:r>
-    </w:p>
-    <w:p/>
-    <w:p>
-      <w:pPr>
-        <w:pStyle w:val="Ttulo2"/>
-        <w:ind w:left="426" w:hanging="426"/>
+        <w:spacing w:before="100" w:beforeAutospacing="1" w:after="100" w:afterAutospacing="1" w:line="360" w:lineRule="auto"/>
+        <w:jc w:val="left"/>
+        <w:rPr>
+          <w:rFonts w:eastAsia="Times New Roman"/>
+          <w:sz w:val="24"/>
+          <w:szCs w:val="24"/>
+        </w:rPr>
       </w:pPr>
       <w:bookmarkStart w:id="3" w:name="_qrnl90280knz" w:colFirst="0" w:colLast="0"/>
       <w:bookmarkStart w:id="4" w:name="_Toc228442933"/>
       <w:bookmarkEnd w:id="3"/>
+      <w:r>
+        <w:rPr>
+          <w:rFonts w:eastAsia="Times New Roman"/>
+          <w:sz w:val="24"/>
+          <w:szCs w:val="24"/>
+        </w:rPr>
+        <w:t xml:space="preserve">A empresa criada pela equipe recebeu o nome de </w:t>
+      </w:r>
+      <w:proofErr w:type="spellStart"/>
+      <w:r>
+        <w:rPr>
+          <w:rFonts w:eastAsia="Times New Roman"/>
+          <w:sz w:val="24"/>
+          <w:szCs w:val="24"/>
+        </w:rPr>
+        <w:t>Draxen</w:t>
+      </w:r>
+      <w:proofErr w:type="spellEnd"/>
+      <w:r>
+        <w:rPr>
+          <w:rFonts w:eastAsia="Times New Roman"/>
+          <w:sz w:val="24"/>
+          <w:szCs w:val="24"/>
+        </w:rPr>
+        <w:t xml:space="preserve"> Systems e foi idealizada com o propósito de desenvolver soluções tecnológicas inovadoras para otimizar a gestão de empresas e organizações de diversos setores. Nosso objetivo é utilizar a tecnologia para trazer mais praticidade, automatizar processos manuais e modernizar a infraestrutura digital de nossos clientes, oferecendo soluções acessíveis, funcionais e alinhadas às necessidades atuais do mercado.</w:t>
+      </w:r>
+    </w:p>
+    <w:p>
+      <w:pPr>
+        <w:spacing w:before="100" w:beforeAutospacing="1" w:after="100" w:afterAutospacing="1" w:line="360" w:lineRule="auto"/>
+        <w:jc w:val="left"/>
+        <w:rPr>
+          <w:rFonts w:eastAsia="Times New Roman"/>
+          <w:sz w:val="24"/>
+          <w:szCs w:val="24"/>
+        </w:rPr>
+      </w:pPr>
+      <w:r>
+        <w:rPr>
+          <w:rFonts w:eastAsia="Times New Roman"/>
+          <w:sz w:val="24"/>
+          <w:szCs w:val="24"/>
+        </w:rPr>
+        <w:t>A proposta da empresa é atuar tanto no apoio a empreendedores e empresas quanto em instituições sociais e projetos voluntários, utilizando a tecnologia como ferramenta de transformação. Dessa forma, buscamos contribuir para uma melhor organização, maior produtividade e mais eficiência nos processos internos, ajudando diferentes tipos de clientes a alcançarem melhores resultados.</w:t>
+      </w:r>
+    </w:p>
+    <w:p>
+      <w:pPr>
+        <w:spacing w:before="100" w:beforeAutospacing="1" w:after="100" w:afterAutospacing="1" w:line="360" w:lineRule="auto"/>
+        <w:jc w:val="left"/>
+        <w:rPr>
+          <w:sz w:val="24"/>
+          <w:szCs w:val="24"/>
+        </w:rPr>
+      </w:pPr>
+      <w:r>
+        <w:rPr>
+          <w:sz w:val="24"/>
+          <w:szCs w:val="24"/>
+        </w:rPr>
+        <w:t xml:space="preserve">Como projeto inaugural e prova de capacidade técnica, a equipe identificou uma forte carência de gestão no terceiro setor. Assim nasceu o </w:t>
+      </w:r>
+      <w:proofErr w:type="spellStart"/>
+      <w:r>
+        <w:rPr>
+          <w:sz w:val="24"/>
+          <w:szCs w:val="24"/>
+        </w:rPr>
+        <w:t>One</w:t>
+      </w:r>
+      <w:proofErr w:type="spellEnd"/>
+      <w:r>
+        <w:rPr>
+          <w:sz w:val="24"/>
+          <w:szCs w:val="24"/>
+        </w:rPr>
+        <w:t xml:space="preserve"> Help, um sistema desenvolvido especificamente para auxiliar ONGs de proteção animal. O software foca em organizar rotinas, controlar dados e melhorar a comunicação dessas instituições com a comunidade.</w:t>
+      </w:r>
+    </w:p>
+    <w:p>
+      <w:pPr>
+        <w:spacing w:before="100" w:beforeAutospacing="1" w:after="100" w:afterAutospacing="1" w:line="360" w:lineRule="auto"/>
+        <w:jc w:val="left"/>
+        <w:rPr>
+          <w:rFonts w:eastAsia="Times New Roman"/>
+          <w:sz w:val="24"/>
+          <w:szCs w:val="24"/>
+        </w:rPr>
+      </w:pPr>
+      <w:r>
+        <w:rPr>
+          <w:rFonts w:eastAsia="Times New Roman"/>
+          <w:sz w:val="24"/>
+          <w:szCs w:val="24"/>
+        </w:rPr>
+        <w:t>Seguindo os princípios do Scrum, conforme apresentado no Guia SBOK (</w:t>
+      </w:r>
+      <w:proofErr w:type="spellStart"/>
+      <w:r>
+        <w:rPr>
+          <w:rFonts w:eastAsia="Times New Roman"/>
+          <w:sz w:val="24"/>
+          <w:szCs w:val="24"/>
+        </w:rPr>
+        <w:t>SCRUMstudy</w:t>
+      </w:r>
+      <w:proofErr w:type="spellEnd"/>
+      <w:r>
+        <w:rPr>
+          <w:rFonts w:eastAsia="Times New Roman"/>
+          <w:sz w:val="24"/>
+          <w:szCs w:val="24"/>
+        </w:rPr>
+        <w:t>, 2016), a equipe atua como um time ágil, com foco em colaboração, adaptação e entregas contínuas. O desenvolvimento é realizado em etapas menores, permitindo acompanhar o progresso do projeto com mais clareza e realizar ajustes sempre que necessário, de acordo com as necessidades identificadas ao longo do processo.</w:t>
+      </w:r>
+    </w:p>
+    <w:p>
+      <w:pPr>
+        <w:spacing w:before="100" w:beforeAutospacing="1" w:after="100" w:afterAutospacing="1" w:line="360" w:lineRule="auto"/>
+        <w:jc w:val="left"/>
+        <w:rPr>
+          <w:rFonts w:eastAsia="Times New Roman"/>
+          <w:sz w:val="24"/>
+          <w:szCs w:val="24"/>
+        </w:rPr>
+      </w:pPr>
+      <w:r>
+        <w:rPr>
+          <w:rFonts w:eastAsia="Times New Roman"/>
+          <w:sz w:val="24"/>
+          <w:szCs w:val="24"/>
+        </w:rPr>
+        <w:t xml:space="preserve">Essa metodologia contribui para uma melhor divisão de tarefas, maior integração entre os membros da equipe e mais eficiência no desenvolvimento do sistema. Dessa forma, a </w:t>
+      </w:r>
+      <w:proofErr w:type="spellStart"/>
+      <w:r>
+        <w:rPr>
+          <w:rFonts w:eastAsia="Times New Roman"/>
+          <w:sz w:val="24"/>
+          <w:szCs w:val="24"/>
+        </w:rPr>
+        <w:t>Draxen</w:t>
+      </w:r>
+      <w:proofErr w:type="spellEnd"/>
+      <w:r>
+        <w:rPr>
+          <w:rFonts w:eastAsia="Times New Roman"/>
+          <w:sz w:val="24"/>
+          <w:szCs w:val="24"/>
+        </w:rPr>
+        <w:t xml:space="preserve"> Systems busca entregar não apenas um software funcional, mas uma solução que gere impacto positivo e contribua tanto para o crescimento de empresas quanto para o fortalecimento de causas sociais.</w:t>
+      </w:r>
+    </w:p>
+    <w:p>
+      <w:pPr>
+        <w:pStyle w:val="Ttulo2"/>
+        <w:ind w:left="426" w:hanging="426"/>
+      </w:pPr>
       <w:r>
         <w:lastRenderedPageBreak/>
         <w:t xml:space="preserve">1.2 </w:t>
@@ -4416,6 +4414,190 @@
       </w:r>
     </w:p>
     <w:p>
+      <w:r>
+        <w:rPr>
+          <w:rFonts w:ascii="Times New Roman" w:eastAsia="Times New Roman" w:hAnsi="Times New Roman" w:cs="Times New Roman"/>
+          <w:noProof/>
+          <w:sz w:val="24"/>
+          <w:szCs w:val="24"/>
+        </w:rPr>
+        <w:drawing>
+          <wp:anchor distT="0" distB="0" distL="114300" distR="114300" simplePos="0" relativeHeight="251664384" behindDoc="0" locked="0" layoutInCell="1" allowOverlap="1" wp14:anchorId="56ABE7A4" wp14:editId="4FE9097C">
+            <wp:simplePos x="0" y="0"/>
+            <wp:positionH relativeFrom="page">
+              <wp:align>center</wp:align>
+            </wp:positionH>
+            <wp:positionV relativeFrom="paragraph">
+              <wp:posOffset>353364</wp:posOffset>
+            </wp:positionV>
+            <wp:extent cx="7448211" cy="4190337"/>
+            <wp:effectExtent l="0" t="0" r="635" b="1270"/>
+            <wp:wrapTopAndBottom/>
+            <wp:docPr id="5" name="Imagem 5"/>
+            <wp:cNvGraphicFramePr>
+              <a:graphicFrameLocks xmlns:a="http://schemas.openxmlformats.org/drawingml/2006/main" noChangeAspect="1"/>
+            </wp:cNvGraphicFramePr>
+            <a:graphic xmlns:a="http://schemas.openxmlformats.org/drawingml/2006/main">
+              <a:graphicData uri="http://schemas.openxmlformats.org/drawingml/2006/picture">
+                <pic:pic xmlns:pic="http://schemas.openxmlformats.org/drawingml/2006/picture">
+                  <pic:nvPicPr>
+                    <pic:cNvPr id="0" name="Picture 1"/>
+                    <pic:cNvPicPr>
+                      <a:picLocks noChangeAspect="1" noChangeArrowheads="1"/>
+                    </pic:cNvPicPr>
+                  </pic:nvPicPr>
+                  <pic:blipFill>
+                    <a:blip r:embed="rId11" cstate="print">
+                      <a:extLst>
+                        <a:ext uri="{28A0092B-C50C-407E-A947-70E740481C1C}">
+                          <a14:useLocalDpi xmlns:a14="http://schemas.microsoft.com/office/drawing/2010/main" val="0"/>
+                        </a:ext>
+                      </a:extLst>
+                    </a:blip>
+                    <a:srcRect/>
+                    <a:stretch>
+                      <a:fillRect/>
+                    </a:stretch>
+                  </pic:blipFill>
+                  <pic:spPr bwMode="auto">
+                    <a:xfrm>
+                      <a:off x="0" y="0"/>
+                      <a:ext cx="7448211" cy="4190337"/>
+                    </a:xfrm>
+                    <a:prstGeom prst="rect">
+                      <a:avLst/>
+                    </a:prstGeom>
+                    <a:noFill/>
+                    <a:ln>
+                      <a:noFill/>
+                    </a:ln>
+                  </pic:spPr>
+                </pic:pic>
+              </a:graphicData>
+            </a:graphic>
+            <wp14:sizeRelH relativeFrom="margin">
+              <wp14:pctWidth>0</wp14:pctWidth>
+            </wp14:sizeRelH>
+            <wp14:sizeRelV relativeFrom="margin">
+              <wp14:pctHeight>0</wp14:pctHeight>
+            </wp14:sizeRelV>
+          </wp:anchor>
+        </w:drawing>
+      </w:r>
+    </w:p>
+    <w:p>
+      <w:pPr>
+        <w:spacing w:before="100" w:beforeAutospacing="1" w:after="100" w:afterAutospacing="1" w:line="240" w:lineRule="auto"/>
+        <w:jc w:val="left"/>
+        <w:rPr>
+          <w:rFonts w:ascii="Times New Roman" w:eastAsia="Times New Roman" w:hAnsi="Times New Roman" w:cs="Times New Roman"/>
+          <w:sz w:val="24"/>
+          <w:szCs w:val="24"/>
+        </w:rPr>
+      </w:pPr>
+    </w:p>
+    <w:p/>
+    <w:p>
+      <w:pPr>
+        <w:rPr>
+          <w:color w:val="A6A6A6" w:themeColor="background1" w:themeShade="A6"/>
+          <w:sz w:val="24"/>
+          <w:szCs w:val="24"/>
+          <w:lang w:val="pt-PT"/>
+        </w:rPr>
+      </w:pPr>
+    </w:p>
+    <w:p>
+      <w:pPr>
+        <w:rPr>
+          <w:color w:val="A6A6A6" w:themeColor="background1" w:themeShade="A6"/>
+          <w:sz w:val="24"/>
+          <w:szCs w:val="24"/>
+          <w:lang w:val="pt-PT"/>
+        </w:rPr>
+      </w:pPr>
+    </w:p>
+    <w:p>
+      <w:pPr>
+        <w:rPr>
+          <w:color w:val="A6A6A6" w:themeColor="background1" w:themeShade="A6"/>
+          <w:sz w:val="24"/>
+          <w:szCs w:val="24"/>
+          <w:lang w:val="pt-PT"/>
+        </w:rPr>
+      </w:pPr>
+    </w:p>
+    <w:p>
+      <w:pPr>
+        <w:rPr>
+          <w:color w:val="A6A6A6" w:themeColor="background1" w:themeShade="A6"/>
+          <w:sz w:val="24"/>
+          <w:szCs w:val="24"/>
+          <w:lang w:val="pt-PT"/>
+        </w:rPr>
+      </w:pPr>
+    </w:p>
+    <w:p>
+      <w:pPr>
+        <w:rPr>
+          <w:color w:val="A6A6A6" w:themeColor="background1" w:themeShade="A6"/>
+          <w:sz w:val="24"/>
+          <w:szCs w:val="24"/>
+          <w:lang w:val="pt-PT"/>
+        </w:rPr>
+      </w:pPr>
+    </w:p>
+    <w:p>
+      <w:pPr>
+        <w:rPr>
+          <w:color w:val="A6A6A6" w:themeColor="background1" w:themeShade="A6"/>
+          <w:sz w:val="24"/>
+          <w:szCs w:val="24"/>
+          <w:lang w:val="pt-PT"/>
+        </w:rPr>
+      </w:pPr>
+    </w:p>
+    <w:p>
+      <w:pPr>
+        <w:rPr>
+          <w:color w:val="A6A6A6" w:themeColor="background1" w:themeShade="A6"/>
+          <w:sz w:val="24"/>
+          <w:szCs w:val="24"/>
+          <w:lang w:val="pt-PT"/>
+        </w:rPr>
+      </w:pPr>
+    </w:p>
+    <w:p>
+      <w:pPr>
+        <w:rPr>
+          <w:color w:val="A6A6A6" w:themeColor="background1" w:themeShade="A6"/>
+          <w:sz w:val="24"/>
+          <w:szCs w:val="24"/>
+          <w:lang w:val="pt-PT"/>
+        </w:rPr>
+      </w:pPr>
+    </w:p>
+    <w:p>
+      <w:pPr>
+        <w:rPr>
+          <w:color w:val="A6A6A6" w:themeColor="background1" w:themeShade="A6"/>
+          <w:sz w:val="24"/>
+          <w:szCs w:val="24"/>
+          <w:lang w:val="pt-PT"/>
+        </w:rPr>
+      </w:pPr>
+    </w:p>
+    <w:p>
+      <w:pPr>
+        <w:rPr>
+          <w:color w:val="A6A6A6" w:themeColor="background1" w:themeShade="A6"/>
+          <w:sz w:val="24"/>
+          <w:szCs w:val="24"/>
+          <w:lang w:val="pt-PT"/>
+        </w:rPr>
+      </w:pPr>
+    </w:p>
+    <w:p>
       <w:pPr>
         <w:rPr>
           <w:color w:val="A6A6A6" w:themeColor="background1" w:themeShade="A6"/>
@@ -4432,6 +4614,7 @@
       </w:pPr>
       <w:bookmarkStart w:id="7" w:name="_Toc228442935"/>
       <w:r>
+        <w:lastRenderedPageBreak/>
         <w:t xml:space="preserve">1.4 </w:t>
       </w:r>
       <w:proofErr w:type="spellStart"/>
@@ -4624,7 +4807,7 @@
         </w:rPr>
         <w:t xml:space="preserve">2024. Disponível em: </w:t>
       </w:r>
-      <w:hyperlink r:id="rId11" w:history="1">
+      <w:hyperlink r:id="rId12" w:history="1">
         <w:r>
           <w:rPr>
             <w:rStyle w:val="Hyperlink"/>
@@ -4816,7 +4999,6 @@
       </w:pPr>
       <w:bookmarkStart w:id="11" w:name="_Toc228442938"/>
       <w:r>
-        <w:lastRenderedPageBreak/>
         <w:t>1.</w:t>
       </w:r>
       <w:r>
@@ -4987,208 +5169,6 @@
         </w:rPr>
       </w:pPr>
       <w:bookmarkStart w:id="14" w:name="_Hlk80775798"/>
-      <w:r>
-        <w:rPr>
-          <w:color w:val="A6A6A6" w:themeColor="background1" w:themeShade="A6"/>
-          <w:sz w:val="24"/>
-          <w:szCs w:val="24"/>
-        </w:rPr>
-        <w:t xml:space="preserve">SCRUMSTUDY, </w:t>
-      </w:r>
-      <w:r>
-        <w:rPr>
-          <w:b/>
-          <w:bCs/>
-          <w:color w:val="A6A6A6" w:themeColor="background1" w:themeShade="A6"/>
-          <w:sz w:val="24"/>
-          <w:szCs w:val="24"/>
-        </w:rPr>
-        <w:t>Guia SBOK: Guia para o Conhecimento em Scrum</w:t>
-      </w:r>
-      <w:r>
-        <w:rPr>
-          <w:color w:val="A6A6A6" w:themeColor="background1" w:themeShade="A6"/>
-          <w:sz w:val="24"/>
-          <w:szCs w:val="24"/>
-        </w:rPr>
-        <w:t xml:space="preserve">, Arizona, EUA: </w:t>
-      </w:r>
-      <w:proofErr w:type="spellStart"/>
-      <w:r>
-        <w:rPr>
-          <w:color w:val="A6A6A6" w:themeColor="background1" w:themeShade="A6"/>
-          <w:sz w:val="24"/>
-          <w:szCs w:val="24"/>
-        </w:rPr>
-        <w:t>SCRUMstudy</w:t>
-      </w:r>
-      <w:proofErr w:type="spellEnd"/>
-      <w:r>
-        <w:rPr>
-          <w:color w:val="A6A6A6" w:themeColor="background1" w:themeShade="A6"/>
-          <w:sz w:val="24"/>
-          <w:szCs w:val="24"/>
-        </w:rPr>
-        <w:t xml:space="preserve">, 2016. </w:t>
-      </w:r>
-      <w:hyperlink r:id="rId12" w:history="1">
-        <w:r>
-          <w:rPr>
-            <w:color w:val="A6A6A6" w:themeColor="background1" w:themeShade="A6"/>
-          </w:rPr>
-          <w:t>https://www.Scrumstudy.com/SBOK/SCRUMstudy-SBOK-Guide-2016-Portuguese.pdf</w:t>
-        </w:r>
-      </w:hyperlink>
-      <w:r>
-        <w:rPr>
-          <w:color w:val="A6A6A6" w:themeColor="background1" w:themeShade="A6"/>
-          <w:sz w:val="24"/>
-          <w:szCs w:val="24"/>
-        </w:rPr>
-        <w:t>. Acesso em: 08 mar. 202</w:t>
-      </w:r>
-      <w:r>
-        <w:rPr>
-          <w:color w:val="A6A6A6" w:themeColor="background1" w:themeShade="A6"/>
-          <w:sz w:val="24"/>
-          <w:szCs w:val="24"/>
-        </w:rPr>
-        <w:t>4</w:t>
-      </w:r>
-      <w:r>
-        <w:rPr>
-          <w:color w:val="A6A6A6" w:themeColor="background1" w:themeShade="A6"/>
-          <w:sz w:val="24"/>
-          <w:szCs w:val="24"/>
-        </w:rPr>
-        <w:t>.</w:t>
-      </w:r>
-    </w:p>
-    <w:bookmarkEnd w:id="14"/>
-    <w:p>
-      <w:pPr>
-        <w:rPr>
-          <w:b/>
-          <w:color w:val="A6A6A6" w:themeColor="background1" w:themeShade="A6"/>
-          <w:sz w:val="24"/>
-          <w:szCs w:val="24"/>
-        </w:rPr>
-      </w:pPr>
-    </w:p>
-    <w:p>
-      <w:pPr>
-        <w:pStyle w:val="Ttulo2"/>
-        <w:ind w:left="426" w:hanging="426"/>
-      </w:pPr>
-      <w:bookmarkStart w:id="15" w:name="_Toc228442939"/>
-      <w:r>
-        <w:t>1.</w:t>
-      </w:r>
-      <w:r>
-        <w:t>8</w:t>
-      </w:r>
-      <w:r>
-        <w:t xml:space="preserve"> </w:t>
-      </w:r>
-      <w:r>
-        <w:rPr>
-          <w:i/>
-          <w:iCs/>
-        </w:rPr>
-        <w:t>Backlog</w:t>
-      </w:r>
-      <w:r>
-        <w:t xml:space="preserve"> dos </w:t>
-      </w:r>
-      <w:r>
-        <w:rPr>
-          <w:i/>
-          <w:iCs/>
-        </w:rPr>
-        <w:t>Sprints</w:t>
-      </w:r>
-      <w:bookmarkEnd w:id="15"/>
-    </w:p>
-    <w:p/>
-    <w:p>
-      <w:r>
-        <w:t xml:space="preserve">Apresentar o </w:t>
-      </w:r>
-      <w:r>
-        <w:rPr>
-          <w:i/>
-          <w:iCs/>
-        </w:rPr>
-        <w:t xml:space="preserve">Backlog </w:t>
-      </w:r>
-      <w:r>
-        <w:t>dos Sprints conforme desenvolvido nas seis semanas de atividades de planejamento e desenvolvimento do projeto.</w:t>
-      </w:r>
-    </w:p>
-    <w:p/>
-    <w:p>
-      <w:pPr>
-        <w:spacing w:after="240"/>
-        <w:rPr>
-          <w:color w:val="A6A6A6" w:themeColor="background1" w:themeShade="A6"/>
-          <w:sz w:val="24"/>
-          <w:szCs w:val="24"/>
-        </w:rPr>
-      </w:pPr>
-      <w:r>
-        <w:rPr>
-          <w:color w:val="A6A6A6" w:themeColor="background1" w:themeShade="A6"/>
-          <w:sz w:val="24"/>
-          <w:szCs w:val="24"/>
-        </w:rPr>
-        <w:t>Sugestão de bibliografia:</w:t>
-      </w:r>
-    </w:p>
-    <w:p>
-      <w:pPr>
-        <w:spacing w:after="240"/>
-        <w:rPr>
-          <w:color w:val="A6A6A6" w:themeColor="background1" w:themeShade="A6"/>
-          <w:sz w:val="24"/>
-          <w:szCs w:val="24"/>
-        </w:rPr>
-      </w:pPr>
-      <w:r>
-        <w:rPr>
-          <w:color w:val="A6A6A6" w:themeColor="background1" w:themeShade="A6"/>
-          <w:sz w:val="24"/>
-          <w:szCs w:val="24"/>
-        </w:rPr>
-        <w:t xml:space="preserve">SUTHERLAND, J. </w:t>
-      </w:r>
-      <w:r>
-        <w:rPr>
-          <w:b/>
-          <w:bCs/>
-          <w:color w:val="A6A6A6" w:themeColor="background1" w:themeShade="A6"/>
-          <w:sz w:val="24"/>
-          <w:szCs w:val="24"/>
-        </w:rPr>
-        <w:t>Scrum</w:t>
-      </w:r>
-      <w:r>
-        <w:rPr>
-          <w:color w:val="A6A6A6" w:themeColor="background1" w:themeShade="A6"/>
-          <w:sz w:val="24"/>
-          <w:szCs w:val="24"/>
-        </w:rPr>
-        <w:t>: a arte de fazer o dobro do trabalho na metade do tempo. Rio de Janeiro: Sextante, 2019.</w:t>
-      </w:r>
-    </w:p>
-    <w:p>
-      <w:pPr>
-        <w:spacing w:after="240"/>
-        <w:rPr>
-          <w:color w:val="A6A6A6" w:themeColor="background1" w:themeShade="A6"/>
-          <w:sz w:val="24"/>
-          <w:szCs w:val="24"/>
-        </w:rPr>
-      </w:pPr>
       <w:r>
         <w:rPr>
           <w:color w:val="A6A6A6" w:themeColor="background1" w:themeShade="A6"/>
@@ -5266,91 +5246,69 @@
         <w:t>.</w:t>
       </w:r>
     </w:p>
-    <w:p/>
-    <w:p/>
+    <w:bookmarkEnd w:id="14"/>
+    <w:p>
+      <w:pPr>
+        <w:rPr>
+          <w:b/>
+          <w:color w:val="A6A6A6" w:themeColor="background1" w:themeShade="A6"/>
+          <w:sz w:val="24"/>
+          <w:szCs w:val="24"/>
+        </w:rPr>
+      </w:pPr>
+    </w:p>
     <w:p>
       <w:pPr>
         <w:pStyle w:val="Ttulo2"/>
         <w:ind w:left="426" w:hanging="426"/>
       </w:pPr>
-      <w:bookmarkStart w:id="16" w:name="_Toc228442940"/>
+      <w:bookmarkStart w:id="15" w:name="_Toc228442939"/>
       <w:r>
         <w:t>1.</w:t>
       </w:r>
       <w:r>
-        <w:t>9</w:t>
+        <w:t>8</w:t>
       </w:r>
       <w:r>
         <w:t xml:space="preserve"> </w:t>
       </w:r>
-      <w:r>
-        <w:t xml:space="preserve">Entregáveis – </w:t>
-      </w:r>
-      <w:proofErr w:type="spellStart"/>
       <w:r>
         <w:rPr>
           <w:i/>
           <w:iCs/>
         </w:rPr>
-        <w:t>Minimum</w:t>
-      </w:r>
-      <w:proofErr w:type="spellEnd"/>
+        <w:t>Backlog</w:t>
+      </w:r>
+      <w:r>
+        <w:t xml:space="preserve"> dos </w:t>
+      </w:r>
       <w:r>
         <w:rPr>
           <w:i/>
           <w:iCs/>
         </w:rPr>
-        <w:t xml:space="preserve"> </w:t>
-      </w:r>
-      <w:proofErr w:type="spellStart"/>
+        <w:t>Sprints</w:t>
+      </w:r>
+      <w:bookmarkEnd w:id="15"/>
+    </w:p>
+    <w:p/>
+    <w:p>
+      <w:r>
+        <w:t xml:space="preserve">Apresentar o </w:t>
+      </w:r>
       <w:r>
         <w:rPr>
           <w:i/>
           <w:iCs/>
         </w:rPr>
-        <w:t>Viable</w:t>
-      </w:r>
-      <w:proofErr w:type="spellEnd"/>
-      <w:r>
-        <w:rPr>
-          <w:i/>
-          <w:iCs/>
-        </w:rPr>
-        <w:t xml:space="preserve"> </w:t>
-      </w:r>
-      <w:proofErr w:type="spellStart"/>
-      <w:r>
-        <w:rPr>
-          <w:i/>
-          <w:iCs/>
-        </w:rPr>
-        <w:t>Product</w:t>
-      </w:r>
-      <w:proofErr w:type="spellEnd"/>
-      <w:r>
-        <w:t xml:space="preserve"> (MVP)</w:t>
-      </w:r>
-      <w:bookmarkEnd w:id="16"/>
+        <w:t xml:space="preserve">Backlog </w:t>
+      </w:r>
+      <w:r>
+        <w:t>dos Sprints conforme desenvolvido nas seis semanas de atividades de planejamento e desenvolvimento do projeto.</w:t>
+      </w:r>
     </w:p>
     <w:p/>
     <w:p>
-      <w:r>
-        <w:t xml:space="preserve">Apresentar </w:t>
-      </w:r>
-      <w:r>
-        <w:t xml:space="preserve">as diferentes versões dos </w:t>
-      </w:r>
-      <w:proofErr w:type="spellStart"/>
-      <w:r>
-        <w:t>MVPs</w:t>
-      </w:r>
-      <w:proofErr w:type="spellEnd"/>
-      <w:r>
-        <w:t xml:space="preserve"> do produto em formato de entregáveis realizados durante as seis semanas de atividades do projeto.</w:t>
-      </w:r>
-    </w:p>
-    <w:p/>
-    <w:p>
       <w:pPr>
         <w:spacing w:after="240"/>
         <w:rPr>
@@ -5366,132 +5324,6 @@
           <w:szCs w:val="24"/>
         </w:rPr>
         <w:t>Sugestão de bibliografia:</w:t>
-      </w:r>
-    </w:p>
-    <w:p>
-      <w:pPr>
-        <w:spacing w:after="240"/>
-        <w:rPr>
-          <w:color w:val="A6A6A6" w:themeColor="background1" w:themeShade="A6"/>
-          <w:sz w:val="24"/>
-          <w:szCs w:val="24"/>
-        </w:rPr>
-      </w:pPr>
-      <w:r>
-        <w:rPr>
-          <w:color w:val="A6A6A6" w:themeColor="background1" w:themeShade="A6"/>
-          <w:sz w:val="24"/>
-          <w:szCs w:val="24"/>
-        </w:rPr>
-        <w:lastRenderedPageBreak/>
-        <w:t xml:space="preserve">MATSUMOTO, Mayra, </w:t>
-      </w:r>
-      <w:r>
-        <w:rPr>
-          <w:b/>
-          <w:bCs/>
-          <w:color w:val="A6A6A6" w:themeColor="background1" w:themeShade="A6"/>
-          <w:sz w:val="24"/>
-          <w:szCs w:val="24"/>
-        </w:rPr>
-        <w:t>MVP</w:t>
-      </w:r>
-      <w:r>
-        <w:rPr>
-          <w:color w:val="A6A6A6" w:themeColor="background1" w:themeShade="A6"/>
-          <w:sz w:val="24"/>
-          <w:szCs w:val="24"/>
-        </w:rPr>
-        <w:t>: a forma eficiente de criar, validar e comercializar um novo produto ou serviço, Kindle: Amazon.com, 2020.</w:t>
-      </w:r>
-    </w:p>
-    <w:p>
-      <w:pPr>
-        <w:spacing w:after="240"/>
-        <w:rPr>
-          <w:color w:val="A6A6A6" w:themeColor="background1" w:themeShade="A6"/>
-          <w:sz w:val="24"/>
-          <w:szCs w:val="24"/>
-        </w:rPr>
-      </w:pPr>
-      <w:r>
-        <w:rPr>
-          <w:color w:val="A6A6A6" w:themeColor="background1" w:themeShade="A6"/>
-          <w:sz w:val="24"/>
-          <w:szCs w:val="24"/>
-          <w:lang w:val="en-US"/>
-        </w:rPr>
-        <w:t xml:space="preserve">RIES, E. </w:t>
-      </w:r>
-      <w:r>
-        <w:rPr>
-          <w:b/>
-          <w:bCs/>
-          <w:color w:val="A6A6A6" w:themeColor="background1" w:themeShade="A6"/>
-          <w:sz w:val="24"/>
-          <w:szCs w:val="24"/>
-          <w:lang w:val="en-US"/>
-        </w:rPr>
-        <w:t xml:space="preserve">A Startup </w:t>
-      </w:r>
-      <w:proofErr w:type="spellStart"/>
-      <w:r>
-        <w:rPr>
-          <w:b/>
-          <w:bCs/>
-          <w:color w:val="A6A6A6" w:themeColor="background1" w:themeShade="A6"/>
-          <w:sz w:val="24"/>
-          <w:szCs w:val="24"/>
-          <w:lang w:val="en-US"/>
-        </w:rPr>
-        <w:t>Enxuta</w:t>
-      </w:r>
-      <w:proofErr w:type="spellEnd"/>
-      <w:r>
-        <w:rPr>
-          <w:b/>
-          <w:bCs/>
-          <w:color w:val="A6A6A6" w:themeColor="background1" w:themeShade="A6"/>
-          <w:sz w:val="24"/>
-          <w:szCs w:val="24"/>
-          <w:lang w:val="en-US"/>
-        </w:rPr>
-        <w:t>.</w:t>
-      </w:r>
-      <w:r>
-        <w:rPr>
-          <w:color w:val="A6A6A6" w:themeColor="background1" w:themeShade="A6"/>
-          <w:sz w:val="24"/>
-          <w:szCs w:val="24"/>
-          <w:lang w:val="en-US"/>
-        </w:rPr>
-        <w:t xml:space="preserve"> </w:t>
-      </w:r>
-      <w:r>
-        <w:rPr>
-          <w:color w:val="A6A6A6" w:themeColor="background1" w:themeShade="A6"/>
-          <w:sz w:val="24"/>
-          <w:szCs w:val="24"/>
-        </w:rPr>
-        <w:t xml:space="preserve">São Paulo: Editora </w:t>
-      </w:r>
-      <w:proofErr w:type="spellStart"/>
-      <w:r>
-        <w:rPr>
-          <w:color w:val="A6A6A6" w:themeColor="background1" w:themeShade="A6"/>
-          <w:sz w:val="24"/>
-          <w:szCs w:val="24"/>
-        </w:rPr>
-        <w:t>Leya</w:t>
-      </w:r>
-      <w:proofErr w:type="spellEnd"/>
-      <w:r>
-        <w:rPr>
-          <w:color w:val="A6A6A6" w:themeColor="background1" w:themeShade="A6"/>
-          <w:sz w:val="24"/>
-          <w:szCs w:val="24"/>
-        </w:rPr>
-        <w:t>, 2019.</w:t>
       </w:r>
     </w:p>
     <w:p>
@@ -5622,42 +5454,84 @@
       <w:pPr>
         <w:pStyle w:val="Ttulo2"/>
         <w:ind w:left="426" w:hanging="426"/>
+      </w:pPr>
+      <w:bookmarkStart w:id="16" w:name="_Toc228442940"/>
+      <w:r>
+        <w:t>1.</w:t>
+      </w:r>
+      <w:r>
+        <w:t>9</w:t>
+      </w:r>
+      <w:r>
+        <w:t xml:space="preserve"> </w:t>
+      </w:r>
+      <w:r>
+        <w:t xml:space="preserve">Entregáveis – </w:t>
+      </w:r>
+      <w:proofErr w:type="spellStart"/>
+      <w:r>
         <w:rPr>
           <w:i/>
           <w:iCs/>
         </w:rPr>
-      </w:pPr>
-      <w:bookmarkStart w:id="17" w:name="_Toc228442941"/>
-      <w:r>
-        <w:t>1.</w:t>
-      </w:r>
-      <w:r>
-        <w:t>10</w:t>
-      </w:r>
-      <w:r>
-        <w:t xml:space="preserve"> </w:t>
-      </w:r>
-      <w:r>
-        <w:t xml:space="preserve">Retrospectiva dos </w:t>
-      </w:r>
+        <w:t>Minimum</w:t>
+      </w:r>
+      <w:proofErr w:type="spellEnd"/>
       <w:r>
         <w:rPr>
           <w:i/>
           <w:iCs/>
         </w:rPr>
-        <w:t>Sprints</w:t>
-      </w:r>
-      <w:bookmarkEnd w:id="17"/>
+        <w:t xml:space="preserve"> </w:t>
+      </w:r>
+      <w:proofErr w:type="spellStart"/>
+      <w:r>
+        <w:rPr>
+          <w:i/>
+          <w:iCs/>
+        </w:rPr>
+        <w:t>Viable</w:t>
+      </w:r>
+      <w:proofErr w:type="spellEnd"/>
+      <w:r>
+        <w:rPr>
+          <w:i/>
+          <w:iCs/>
+        </w:rPr>
+        <w:t xml:space="preserve"> </w:t>
+      </w:r>
+      <w:proofErr w:type="spellStart"/>
+      <w:r>
+        <w:rPr>
+          <w:i/>
+          <w:iCs/>
+        </w:rPr>
+        <w:t>Product</w:t>
+      </w:r>
+      <w:proofErr w:type="spellEnd"/>
+      <w:r>
+        <w:t xml:space="preserve"> (MVP)</w:t>
+      </w:r>
+      <w:bookmarkEnd w:id="16"/>
     </w:p>
     <w:p/>
     <w:p>
       <w:r>
-        <w:t>Apresentar as reflexões e revisões do projeto realizado durante o ritual de retrospectiva dos Sprints.</w:t>
+        <w:t xml:space="preserve">Apresentar </w:t>
+      </w:r>
+      <w:r>
+        <w:t xml:space="preserve">as diferentes versões dos </w:t>
+      </w:r>
+      <w:proofErr w:type="spellStart"/>
+      <w:r>
+        <w:t>MVPs</w:t>
+      </w:r>
+      <w:proofErr w:type="spellEnd"/>
+      <w:r>
+        <w:t xml:space="preserve"> do produto em formato de entregáveis realizados durante as seis semanas de atividades do projeto.</w:t>
       </w:r>
     </w:p>
     <w:p/>
-    <w:p/>
-    <w:p/>
     <w:p>
       <w:pPr>
         <w:spacing w:after="240"/>
@@ -5691,7 +5565,7 @@
           <w:sz w:val="24"/>
           <w:szCs w:val="24"/>
         </w:rPr>
-        <w:t xml:space="preserve">SUTHERLAND, J. </w:t>
+        <w:t xml:space="preserve">MATSUMOTO, Mayra, </w:t>
       </w:r>
       <w:r>
         <w:rPr>
@@ -5701,6 +5575,132 @@
           <w:sz w:val="24"/>
           <w:szCs w:val="24"/>
         </w:rPr>
+        <w:t>MVP</w:t>
+      </w:r>
+      <w:r>
+        <w:rPr>
+          <w:color w:val="A6A6A6" w:themeColor="background1" w:themeShade="A6"/>
+          <w:sz w:val="24"/>
+          <w:szCs w:val="24"/>
+        </w:rPr>
+        <w:t>: a forma eficiente de criar, validar e comercializar um novo produto ou serviço, Kindle: Amazon.com, 2020.</w:t>
+      </w:r>
+    </w:p>
+    <w:p>
+      <w:pPr>
+        <w:spacing w:after="240"/>
+        <w:rPr>
+          <w:color w:val="A6A6A6" w:themeColor="background1" w:themeShade="A6"/>
+          <w:sz w:val="24"/>
+          <w:szCs w:val="24"/>
+        </w:rPr>
+      </w:pPr>
+      <w:r>
+        <w:rPr>
+          <w:color w:val="A6A6A6" w:themeColor="background1" w:themeShade="A6"/>
+          <w:sz w:val="24"/>
+          <w:szCs w:val="24"/>
+          <w:lang w:val="en-US"/>
+        </w:rPr>
+        <w:t xml:space="preserve">RIES, E. </w:t>
+      </w:r>
+      <w:r>
+        <w:rPr>
+          <w:b/>
+          <w:bCs/>
+          <w:color w:val="A6A6A6" w:themeColor="background1" w:themeShade="A6"/>
+          <w:sz w:val="24"/>
+          <w:szCs w:val="24"/>
+          <w:lang w:val="en-US"/>
+        </w:rPr>
+        <w:t xml:space="preserve">A Startup </w:t>
+      </w:r>
+      <w:proofErr w:type="spellStart"/>
+      <w:r>
+        <w:rPr>
+          <w:b/>
+          <w:bCs/>
+          <w:color w:val="A6A6A6" w:themeColor="background1" w:themeShade="A6"/>
+          <w:sz w:val="24"/>
+          <w:szCs w:val="24"/>
+          <w:lang w:val="en-US"/>
+        </w:rPr>
+        <w:t>Enxuta</w:t>
+      </w:r>
+      <w:proofErr w:type="spellEnd"/>
+      <w:r>
+        <w:rPr>
+          <w:b/>
+          <w:bCs/>
+          <w:color w:val="A6A6A6" w:themeColor="background1" w:themeShade="A6"/>
+          <w:sz w:val="24"/>
+          <w:szCs w:val="24"/>
+          <w:lang w:val="en-US"/>
+        </w:rPr>
+        <w:t>.</w:t>
+      </w:r>
+      <w:r>
+        <w:rPr>
+          <w:color w:val="A6A6A6" w:themeColor="background1" w:themeShade="A6"/>
+          <w:sz w:val="24"/>
+          <w:szCs w:val="24"/>
+          <w:lang w:val="en-US"/>
+        </w:rPr>
+        <w:t xml:space="preserve"> </w:t>
+      </w:r>
+      <w:r>
+        <w:rPr>
+          <w:color w:val="A6A6A6" w:themeColor="background1" w:themeShade="A6"/>
+          <w:sz w:val="24"/>
+          <w:szCs w:val="24"/>
+        </w:rPr>
+        <w:t xml:space="preserve">São Paulo: Editora </w:t>
+      </w:r>
+      <w:proofErr w:type="spellStart"/>
+      <w:r>
+        <w:rPr>
+          <w:color w:val="A6A6A6" w:themeColor="background1" w:themeShade="A6"/>
+          <w:sz w:val="24"/>
+          <w:szCs w:val="24"/>
+        </w:rPr>
+        <w:t>Leya</w:t>
+      </w:r>
+      <w:proofErr w:type="spellEnd"/>
+      <w:r>
+        <w:rPr>
+          <w:color w:val="A6A6A6" w:themeColor="background1" w:themeShade="A6"/>
+          <w:sz w:val="24"/>
+          <w:szCs w:val="24"/>
+        </w:rPr>
+        <w:t>, 2019.</w:t>
+      </w:r>
+    </w:p>
+    <w:p>
+      <w:pPr>
+        <w:spacing w:after="240"/>
+        <w:rPr>
+          <w:color w:val="A6A6A6" w:themeColor="background1" w:themeShade="A6"/>
+          <w:sz w:val="24"/>
+          <w:szCs w:val="24"/>
+        </w:rPr>
+      </w:pPr>
+      <w:r>
+        <w:rPr>
+          <w:color w:val="A6A6A6" w:themeColor="background1" w:themeShade="A6"/>
+          <w:sz w:val="24"/>
+          <w:szCs w:val="24"/>
+        </w:rPr>
+        <w:lastRenderedPageBreak/>
+        <w:t xml:space="preserve">SUTHERLAND, J. </w:t>
+      </w:r>
+      <w:r>
+        <w:rPr>
+          <w:b/>
+          <w:bCs/>
+          <w:color w:val="A6A6A6" w:themeColor="background1" w:themeShade="A6"/>
+          <w:sz w:val="24"/>
+          <w:szCs w:val="24"/>
+        </w:rPr>
         <w:t>Scrum</w:t>
       </w:r>
       <w:r>
@@ -5727,7 +5727,25 @@
           <w:sz w:val="24"/>
           <w:szCs w:val="24"/>
         </w:rPr>
-        <w:t xml:space="preserve">SCRUMSTUDY, Guia SBOK: Guia para o Conhecimento em Scrum, Arizona, EUA: </w:t>
+        <w:t xml:space="preserve">SCRUMSTUDY, </w:t>
+      </w:r>
+      <w:r>
+        <w:rPr>
+          <w:b/>
+          <w:bCs/>
+          <w:color w:val="A6A6A6" w:themeColor="background1" w:themeShade="A6"/>
+          <w:sz w:val="24"/>
+          <w:szCs w:val="24"/>
+        </w:rPr>
+        <w:t>Guia SBOK: Guia para o Conhecimento em Scrum</w:t>
+      </w:r>
+      <w:r>
+        <w:rPr>
+          <w:color w:val="A6A6A6" w:themeColor="background1" w:themeShade="A6"/>
+          <w:sz w:val="24"/>
+          <w:szCs w:val="24"/>
+        </w:rPr>
+        <w:t xml:space="preserve">, Arizona, EUA: </w:t>
       </w:r>
       <w:proofErr w:type="spellStart"/>
       <w:r>
@@ -5786,34 +5804,42 @@
       <w:pPr>
         <w:pStyle w:val="Ttulo2"/>
         <w:ind w:left="426" w:hanging="426"/>
-      </w:pPr>
-      <w:bookmarkStart w:id="18" w:name="_Toc228442942"/>
-      <w:r>
-        <w:t>1.1</w:t>
-      </w:r>
-      <w:r>
-        <w:t>1</w:t>
-      </w:r>
-      <w:r>
-        <w:t xml:space="preserve"> Retrospectiva do Projeto.</w:t>
-      </w:r>
-      <w:bookmarkEnd w:id="18"/>
-    </w:p>
-    <w:p>
-      <w:r>
-        <w:t>Apresentar as reflexões e revisões do projeto realizado durante o ritual de retrospectiva do projeto.</w:t>
-      </w:r>
-    </w:p>
-    <w:p>
-      <w:pPr>
-        <w:spacing w:after="240"/>
-        <w:rPr>
-          <w:color w:val="A6A6A6" w:themeColor="background1" w:themeShade="A6"/>
-          <w:sz w:val="24"/>
-          <w:szCs w:val="24"/>
-        </w:rPr>
-      </w:pPr>
-    </w:p>
+        <w:rPr>
+          <w:i/>
+          <w:iCs/>
+        </w:rPr>
+      </w:pPr>
+      <w:bookmarkStart w:id="17" w:name="_Toc228442941"/>
+      <w:r>
+        <w:t>1.</w:t>
+      </w:r>
+      <w:r>
+        <w:t>10</w:t>
+      </w:r>
+      <w:r>
+        <w:t xml:space="preserve"> </w:t>
+      </w:r>
+      <w:r>
+        <w:t xml:space="preserve">Retrospectiva dos </w:t>
+      </w:r>
+      <w:r>
+        <w:rPr>
+          <w:i/>
+          <w:iCs/>
+        </w:rPr>
+        <w:t>Sprints</w:t>
+      </w:r>
+      <w:bookmarkEnd w:id="17"/>
+    </w:p>
+    <w:p/>
+    <w:p>
+      <w:r>
+        <w:t>Apresentar as reflexões e revisões do projeto realizado durante o ritual de retrospectiva dos Sprints.</w:t>
+      </w:r>
+    </w:p>
+    <w:p/>
+    <w:p/>
+    <w:p/>
     <w:p>
       <w:pPr>
         <w:spacing w:after="240"/>
@@ -5883,7 +5909,6 @@
           <w:sz w:val="24"/>
           <w:szCs w:val="24"/>
         </w:rPr>
-        <w:lastRenderedPageBreak/>
         <w:t xml:space="preserve">SCRUMSTUDY, Guia SBOK: Guia para o Conhecimento em Scrum, Arizona, EUA: </w:t>
       </w:r>
       <w:proofErr w:type="spellStart"/>
@@ -5937,6 +5962,162 @@
         <w:t>.</w:t>
       </w:r>
     </w:p>
+    <w:p/>
+    <w:p/>
+    <w:p>
+      <w:pPr>
+        <w:pStyle w:val="Ttulo2"/>
+        <w:ind w:left="426" w:hanging="426"/>
+      </w:pPr>
+      <w:bookmarkStart w:id="18" w:name="_Toc228442942"/>
+      <w:r>
+        <w:t>1.1</w:t>
+      </w:r>
+      <w:r>
+        <w:t>1</w:t>
+      </w:r>
+      <w:r>
+        <w:t xml:space="preserve"> Retrospectiva do Projeto.</w:t>
+      </w:r>
+      <w:bookmarkEnd w:id="18"/>
+    </w:p>
+    <w:p>
+      <w:r>
+        <w:t>Apresentar as reflexões e revisões do projeto realizado durante o ritual de retrospectiva do projeto.</w:t>
+      </w:r>
+    </w:p>
+    <w:p>
+      <w:pPr>
+        <w:spacing w:after="240"/>
+        <w:rPr>
+          <w:color w:val="A6A6A6" w:themeColor="background1" w:themeShade="A6"/>
+          <w:sz w:val="24"/>
+          <w:szCs w:val="24"/>
+        </w:rPr>
+      </w:pPr>
+    </w:p>
+    <w:p>
+      <w:pPr>
+        <w:spacing w:after="240"/>
+        <w:rPr>
+          <w:color w:val="A6A6A6" w:themeColor="background1" w:themeShade="A6"/>
+          <w:sz w:val="24"/>
+          <w:szCs w:val="24"/>
+        </w:rPr>
+      </w:pPr>
+      <w:r>
+        <w:rPr>
+          <w:color w:val="A6A6A6" w:themeColor="background1" w:themeShade="A6"/>
+          <w:sz w:val="24"/>
+          <w:szCs w:val="24"/>
+        </w:rPr>
+        <w:t>Sugestão de bibliografia:</w:t>
+      </w:r>
+    </w:p>
+    <w:p>
+      <w:pPr>
+        <w:spacing w:after="240"/>
+        <w:rPr>
+          <w:color w:val="A6A6A6" w:themeColor="background1" w:themeShade="A6"/>
+          <w:sz w:val="24"/>
+          <w:szCs w:val="24"/>
+        </w:rPr>
+      </w:pPr>
+      <w:r>
+        <w:rPr>
+          <w:color w:val="A6A6A6" w:themeColor="background1" w:themeShade="A6"/>
+          <w:sz w:val="24"/>
+          <w:szCs w:val="24"/>
+        </w:rPr>
+        <w:t xml:space="preserve">SUTHERLAND, J. </w:t>
+      </w:r>
+      <w:r>
+        <w:rPr>
+          <w:b/>
+          <w:bCs/>
+          <w:color w:val="A6A6A6" w:themeColor="background1" w:themeShade="A6"/>
+          <w:sz w:val="24"/>
+          <w:szCs w:val="24"/>
+        </w:rPr>
+        <w:t>Scrum</w:t>
+      </w:r>
+      <w:r>
+        <w:rPr>
+          <w:color w:val="A6A6A6" w:themeColor="background1" w:themeShade="A6"/>
+          <w:sz w:val="24"/>
+          <w:szCs w:val="24"/>
+        </w:rPr>
+        <w:t>: a arte de fazer o dobro do trabalho na metade do tempo. Rio de Janeiro: Sextante, 2019.</w:t>
+      </w:r>
+    </w:p>
+    <w:p>
+      <w:pPr>
+        <w:spacing w:after="240"/>
+        <w:rPr>
+          <w:color w:val="A6A6A6" w:themeColor="background1" w:themeShade="A6"/>
+          <w:sz w:val="24"/>
+          <w:szCs w:val="24"/>
+        </w:rPr>
+      </w:pPr>
+      <w:r>
+        <w:rPr>
+          <w:color w:val="A6A6A6" w:themeColor="background1" w:themeShade="A6"/>
+          <w:sz w:val="24"/>
+          <w:szCs w:val="24"/>
+        </w:rPr>
+        <w:t xml:space="preserve">SCRUMSTUDY, Guia SBOK: Guia para o Conhecimento em Scrum, Arizona, EUA: </w:t>
+      </w:r>
+      <w:proofErr w:type="spellStart"/>
+      <w:r>
+        <w:rPr>
+          <w:color w:val="A6A6A6" w:themeColor="background1" w:themeShade="A6"/>
+          <w:sz w:val="24"/>
+          <w:szCs w:val="24"/>
+        </w:rPr>
+        <w:t>SCRUMstudy</w:t>
+      </w:r>
+      <w:proofErr w:type="spellEnd"/>
+      <w:r>
+        <w:rPr>
+          <w:color w:val="A6A6A6" w:themeColor="background1" w:themeShade="A6"/>
+          <w:sz w:val="24"/>
+          <w:szCs w:val="24"/>
+        </w:rPr>
+        <w:t xml:space="preserve">, 2016. </w:t>
+      </w:r>
+      <w:hyperlink r:id="rId17" w:history="1">
+        <w:r>
+          <w:rPr>
+            <w:color w:val="A6A6A6" w:themeColor="background1" w:themeShade="A6"/>
+          </w:rPr>
+          <w:t>https://www.Scrumstudy.com/SBOK/SCRUMstudy-SBOK-Guide-2016-Portuguese.pdf</w:t>
+        </w:r>
+      </w:hyperlink>
+      <w:r>
+        <w:rPr>
+          <w:color w:val="A6A6A6" w:themeColor="background1" w:themeShade="A6"/>
+          <w:sz w:val="24"/>
+          <w:szCs w:val="24"/>
+        </w:rPr>
+        <w:t>. Acesso em: 08 mar. 202</w:t>
+      </w:r>
+      <w:r>
+        <w:rPr>
+          <w:color w:val="A6A6A6" w:themeColor="background1" w:themeShade="A6"/>
+          <w:sz w:val="24"/>
+          <w:szCs w:val="24"/>
+        </w:rPr>
+        <w:t>4</w:t>
+      </w:r>
+      <w:r>
+        <w:rPr>
+          <w:color w:val="A6A6A6" w:themeColor="background1" w:themeShade="A6"/>
+          <w:sz w:val="24"/>
+          <w:szCs w:val="24"/>
+        </w:rPr>
+        <w:t>.</w:t>
+      </w:r>
+    </w:p>
     <w:p>
       <w:pPr>
         <w:pStyle w:val="Ttulo1"/>
@@ -6916,7 +7097,6 @@
           <w:sz w:val="24"/>
           <w:szCs w:val="24"/>
         </w:rPr>
-        <w:lastRenderedPageBreak/>
         <w:t xml:space="preserve">CRUZ, F. PMO Ágil: </w:t>
       </w:r>
       <w:r>
@@ -6951,6 +7131,7 @@
           <w:sz w:val="24"/>
           <w:szCs w:val="24"/>
         </w:rPr>
+        <w:lastRenderedPageBreak/>
         <w:t xml:space="preserve">CRUZ, F. </w:t>
       </w:r>
       <w:r>
@@ -7394,7 +7575,7 @@
         </w:rPr>
         <w:t xml:space="preserve">Disponível em: </w:t>
       </w:r>
-      <w:hyperlink r:id="rId17" w:history="1">
+      <w:hyperlink r:id="rId18" w:history="1">
         <w:r>
           <w:rPr>
             <w:rStyle w:val="Hyperlink"/>
@@ -7460,7 +7641,7 @@
         </w:rPr>
         <w:t xml:space="preserve">, 2016. </w:t>
       </w:r>
-      <w:hyperlink r:id="rId18" w:history="1">
+      <w:hyperlink r:id="rId19" w:history="1">
         <w:r>
           <w:rPr>
             <w:sz w:val="24"/>
@@ -7596,7 +7777,6 @@
         <w:rPr>
           <w:color w:val="FF0000"/>
         </w:rPr>
-        <w:lastRenderedPageBreak/>
         <w:t>Link</w:t>
       </w:r>
     </w:p>
@@ -7617,6 +7797,7 @@
         <w:rPr>
           <w:color w:val="FF0000"/>
         </w:rPr>
+        <w:lastRenderedPageBreak/>
         <w:t>Anexo II – Cronograma efetivo</w:t>
       </w:r>
       <w:bookmarkEnd w:id="39"/>
@@ -7669,7 +7850,7 @@
       </w:r>
     </w:p>
     <w:sectPr>
-      <w:headerReference w:type="default" r:id="rId19"/>
+      <w:headerReference w:type="default" r:id="rId20"/>
       <w:pgSz w:w="11909" w:h="16834"/>
       <w:pgMar w:top="1701" w:right="1134" w:bottom="1134" w:left="1701" w:header="720" w:footer="720" w:gutter="0"/>
       <w:pgNumType w:start="1"/>
@@ -9001,6 +9182,7 @@
   <w:style w:type="character" w:default="1" w:styleId="Fontepargpadro">
     <w:name w:val="Default Paragraph Font"/>
     <w:uiPriority w:val="1"/>
+    <w:semiHidden/>
     <w:unhideWhenUsed/>
   </w:style>
   <w:style w:type="table" w:default="1" w:styleId="Tabelanormal">
@@ -9867,6 +10049,7 @@
     <w:rsid w:val="00206BAE"/>
     <w:rsid w:val="00272B2F"/>
     <w:rsid w:val="002F716D"/>
+    <w:rsid w:val="00355901"/>
     <w:rsid w:val="003C1C9D"/>
     <w:rsid w:val="004C356F"/>
     <w:rsid w:val="00807BE6"/>
@@ -10701,6 +10884,15 @@
 </file>
 
 <file path=customXml/item1.xml><?xml version="1.0" encoding="utf-8"?>
+<?mso-contentType ?>
+<FormTemplates xmlns="http://schemas.microsoft.com/sharepoint/v3/contenttype/forms">
+  <Display>DocumentLibraryForm</Display>
+  <Edit>DocumentLibraryForm</Edit>
+  <New>DocumentLibraryForm</New>
+</FormTemplates>
+</file>
+
+<file path=customXml/item2.xml><?xml version="1.0" encoding="utf-8"?>
 <ct:contentTypeSchema xmlns:ct="http://schemas.microsoft.com/office/2006/metadata/contentType" xmlns:ma="http://schemas.microsoft.com/office/2006/metadata/properties/metaAttributes" ct:_="" ma:_="" ma:contentTypeName="Documento" ma:contentTypeID="0x0101005F431444096C0E4181EE6841EAE19542" ma:contentTypeVersion="12" ma:contentTypeDescription="Crie um novo documento." ma:contentTypeScope="" ma:versionID="503bdd1a9f63b8253f40292f1dd1451b">
   <xsd:schema xmlns:xsd="http://www.w3.org/2001/XMLSchema" xmlns:xs="http://www.w3.org/2001/XMLSchema" xmlns:p="http://schemas.microsoft.com/office/2006/metadata/properties" xmlns:ns2="c0f35838-16df-4f4e-bd7f-2b54a1c7d614" xmlns:ns3="895e7052-72ef-4766-88c1-3310861ca215" targetNamespace="http://schemas.microsoft.com/office/2006/metadata/properties" ma:root="true" ma:fieldsID="1e3c09c50a731ad849df98dfe5a8e8a5" ns2:_="" ns3:_="">
     <xsd:import namespace="c0f35838-16df-4f4e-bd7f-2b54a1c7d614"/>
@@ -10893,20 +11085,19 @@
 </ct:contentTypeSchema>
 </file>
 
-<file path=customXml/item2.xml><?xml version="1.0" encoding="utf-8"?>
-<?mso-contentType ?>
-<FormTemplates xmlns="http://schemas.microsoft.com/sharepoint/v3/contenttype/forms">
-  <Display>DocumentLibraryForm</Display>
-  <Edit>DocumentLibraryForm</Edit>
-  <New>DocumentLibraryForm</New>
-</FormTemplates>
-</file>
-
 <file path=customXml/item3.xml><?xml version="1.0" encoding="utf-8"?>
 <b:Sources xmlns:b="http://schemas.openxmlformats.org/officeDocument/2006/bibliography" xmlns="http://schemas.openxmlformats.org/officeDocument/2006/bibliography" SelectedStyle="\APASixthEditionOfficeOnline.xsl" StyleName="APA" Version="6"/>
 </file>
 
 <file path=customXml/itemProps1.xml><?xml version="1.0" encoding="utf-8"?>
+<ds:datastoreItem xmlns:ds="http://schemas.openxmlformats.org/officeDocument/2006/customXml" ds:itemID="{0B008465-F6D3-48FC-99F7-E8EBF86DF9F6}">
+  <ds:schemaRefs>
+    <ds:schemaRef ds:uri="http://schemas.microsoft.com/sharepoint/v3/contenttype/forms"/>
+  </ds:schemaRefs>
+</ds:datastoreItem>
+</file>
+
+<file path=customXml/itemProps2.xml><?xml version="1.0" encoding="utf-8"?>
 <ds:datastoreItem xmlns:ds="http://schemas.openxmlformats.org/officeDocument/2006/customXml" ds:itemID="{403CE56D-29DD-463B-8F5F-C2550CBBAA05}">
   <ds:schemaRefs>
     <ds:schemaRef ds:uri="http://schemas.microsoft.com/office/2006/metadata/contentType"/>
@@ -10925,14 +11116,6 @@
 </ds:datastoreItem>
 </file>
 
-<file path=customXml/itemProps2.xml><?xml version="1.0" encoding="utf-8"?>
-<ds:datastoreItem xmlns:ds="http://schemas.openxmlformats.org/officeDocument/2006/customXml" ds:itemID="{0B008465-F6D3-48FC-99F7-E8EBF86DF9F6}">
-  <ds:schemaRefs>
-    <ds:schemaRef ds:uri="http://schemas.microsoft.com/sharepoint/v3/contenttype/forms"/>
-  </ds:schemaRefs>
-</ds:datastoreItem>
-</file>
-
 <file path=customXml/itemProps3.xml><?xml version="1.0" encoding="utf-8"?>
 <ds:datastoreItem xmlns:ds="http://schemas.openxmlformats.org/officeDocument/2006/customXml" ds:itemID="{6F0C982A-CA15-4101-95E9-E83C40D43193}">
   <ds:schemaRefs>

</xml_diff>

<commit_message>
Realizando o Business Model Canvas e Mapa Mental
</commit_message>
<xml_diff>
--- a/Docs/Documentação OneHelp.docx
+++ b/Docs/Documentação OneHelp.docx
@@ -425,7 +425,10 @@
               <w:jc w:val="left"/>
             </w:pPr>
             <w:r>
-              <w:t>Desenvolvimento/ Documentação</w:t>
+              <w:t>Back end.</w:t>
+            </w:r>
+            <w:r>
+              <w:t>/ Documentação</w:t>
             </w:r>
           </w:p>
         </w:tc>
@@ -460,9 +463,6 @@
               <w:jc w:val="left"/>
             </w:pPr>
             <w:r>
-              <w:t xml:space="preserve">Banco de Dados/ </w:t>
-            </w:r>
-            <w:r>
               <w:t>Documentação</w:t>
             </w:r>
           </w:p>
@@ -498,10 +498,18 @@
               <w:jc w:val="left"/>
             </w:pPr>
             <w:r>
-              <w:t xml:space="preserve">Desenvolvimento/ </w:t>
-            </w:r>
-            <w:r>
-              <w:t xml:space="preserve">Front end./ </w:t>
+              <w:t xml:space="preserve">Full </w:t>
+            </w:r>
+            <w:proofErr w:type="spellStart"/>
+            <w:r>
+              <w:t>Stack</w:t>
+            </w:r>
+            <w:proofErr w:type="spellEnd"/>
+            <w:r>
+              <w:t>/</w:t>
+            </w:r>
+            <w:r>
+              <w:t xml:space="preserve"> </w:t>
             </w:r>
             <w:r>
               <w:t>Documentação</w:t>
@@ -541,6 +549,9 @@
             <w:r>
               <w:t>PO/ Scrum Master</w:t>
             </w:r>
+            <w:r>
+              <w:t>/ Banco de Dados</w:t>
+            </w:r>
           </w:p>
         </w:tc>
       </w:tr>
@@ -634,6 +645,7 @@
     <w:p/>
     <w:p>
       <w:r>
+        <w:lastRenderedPageBreak/>
         <w:t>FICHA DE CONTROLE</w:t>
       </w:r>
       <w:r>
@@ -4627,25 +4639,301 @@
       </w:r>
       <w:bookmarkEnd w:id="7"/>
     </w:p>
-    <w:p/>
-    <w:p>
-      <w:r>
-        <w:t xml:space="preserve">Elaborar o Business Model </w:t>
-      </w:r>
-      <w:proofErr w:type="spellStart"/>
-      <w:r>
-        <w:t>Canvas</w:t>
-      </w:r>
-      <w:proofErr w:type="spellEnd"/>
-      <w:r>
-        <w:t xml:space="preserve"> do</w:t>
-      </w:r>
-      <w:r>
-        <w:t xml:space="preserve"> projeto.</w:t>
-      </w:r>
+    <w:p>
+      <w:r>
+        <w:rPr>
+          <w:rFonts w:ascii="Times New Roman" w:eastAsia="Times New Roman" w:hAnsi="Times New Roman" w:cs="Times New Roman"/>
+          <w:noProof/>
+          <w:sz w:val="24"/>
+          <w:szCs w:val="24"/>
+        </w:rPr>
+        <w:drawing>
+          <wp:anchor distT="0" distB="0" distL="114300" distR="114300" simplePos="0" relativeHeight="251665408" behindDoc="0" locked="0" layoutInCell="1" allowOverlap="1" wp14:anchorId="75E21120" wp14:editId="63A93AA4">
+            <wp:simplePos x="0" y="0"/>
+            <wp:positionH relativeFrom="page">
+              <wp:align>center</wp:align>
+            </wp:positionH>
+            <wp:positionV relativeFrom="paragraph">
+              <wp:posOffset>429370</wp:posOffset>
+            </wp:positionV>
+            <wp:extent cx="7384056" cy="5220269"/>
+            <wp:effectExtent l="0" t="0" r="7620" b="0"/>
+            <wp:wrapTopAndBottom/>
+            <wp:docPr id="6" name="Imagem 6"/>
+            <wp:cNvGraphicFramePr>
+              <a:graphicFrameLocks xmlns:a="http://schemas.openxmlformats.org/drawingml/2006/main" noChangeAspect="1"/>
+            </wp:cNvGraphicFramePr>
+            <a:graphic xmlns:a="http://schemas.openxmlformats.org/drawingml/2006/main">
+              <a:graphicData uri="http://schemas.openxmlformats.org/drawingml/2006/picture">
+                <pic:pic xmlns:pic="http://schemas.openxmlformats.org/drawingml/2006/picture">
+                  <pic:nvPicPr>
+                    <pic:cNvPr id="0" name="Picture 1"/>
+                    <pic:cNvPicPr>
+                      <a:picLocks noChangeAspect="1" noChangeArrowheads="1"/>
+                    </pic:cNvPicPr>
+                  </pic:nvPicPr>
+                  <pic:blipFill>
+                    <a:blip r:embed="rId12" cstate="print">
+                      <a:extLst>
+                        <a:ext uri="{28A0092B-C50C-407E-A947-70E740481C1C}">
+                          <a14:useLocalDpi xmlns:a14="http://schemas.microsoft.com/office/drawing/2010/main" val="0"/>
+                        </a:ext>
+                      </a:extLst>
+                    </a:blip>
+                    <a:srcRect/>
+                    <a:stretch>
+                      <a:fillRect/>
+                    </a:stretch>
+                  </pic:blipFill>
+                  <pic:spPr bwMode="auto">
+                    <a:xfrm>
+                      <a:off x="0" y="0"/>
+                      <a:ext cx="7384056" cy="5220269"/>
+                    </a:xfrm>
+                    <a:prstGeom prst="rect">
+                      <a:avLst/>
+                    </a:prstGeom>
+                    <a:noFill/>
+                    <a:ln>
+                      <a:noFill/>
+                    </a:ln>
+                  </pic:spPr>
+                </pic:pic>
+              </a:graphicData>
+            </a:graphic>
+            <wp14:sizeRelH relativeFrom="margin">
+              <wp14:pctWidth>0</wp14:pctWidth>
+            </wp14:sizeRelH>
+            <wp14:sizeRelV relativeFrom="margin">
+              <wp14:pctHeight>0</wp14:pctHeight>
+            </wp14:sizeRelV>
+          </wp:anchor>
+        </w:drawing>
+      </w:r>
+    </w:p>
+    <w:p>
+      <w:pPr>
+        <w:spacing w:before="100" w:beforeAutospacing="1" w:after="100" w:afterAutospacing="1" w:line="240" w:lineRule="auto"/>
+        <w:jc w:val="left"/>
+        <w:rPr>
+          <w:rFonts w:ascii="Times New Roman" w:eastAsia="Times New Roman" w:hAnsi="Times New Roman" w:cs="Times New Roman"/>
+          <w:sz w:val="24"/>
+          <w:szCs w:val="24"/>
+        </w:rPr>
+      </w:pPr>
     </w:p>
     <w:p/>
     <w:p/>
+    <w:p/>
+    <w:p/>
+    <w:p/>
+    <w:p/>
+    <w:p/>
+    <w:p/>
+    <w:p>
+      <w:pPr>
+        <w:pStyle w:val="Ttulo2"/>
+        <w:ind w:left="426" w:hanging="426"/>
+      </w:pPr>
+      <w:bookmarkStart w:id="8" w:name="_Toc228442936"/>
+      <w:r>
+        <w:lastRenderedPageBreak/>
+        <w:t>1.</w:t>
+      </w:r>
+      <w:r>
+        <w:t>5</w:t>
+      </w:r>
+      <w:r>
+        <w:t xml:space="preserve"> Mapa mental do sistema</w:t>
+      </w:r>
+      <w:bookmarkEnd w:id="8"/>
+    </w:p>
+    <w:p>
+      <w:r>
+        <w:rPr>
+          <w:rFonts w:ascii="Times New Roman" w:eastAsia="Times New Roman" w:hAnsi="Times New Roman" w:cs="Times New Roman"/>
+          <w:noProof/>
+          <w:sz w:val="24"/>
+          <w:szCs w:val="24"/>
+        </w:rPr>
+        <w:drawing>
+          <wp:anchor distT="0" distB="0" distL="114300" distR="114300" simplePos="0" relativeHeight="251666432" behindDoc="0" locked="0" layoutInCell="1" allowOverlap="1" wp14:anchorId="2710B6BB" wp14:editId="685EC4C6">
+            <wp:simplePos x="0" y="0"/>
+            <wp:positionH relativeFrom="page">
+              <wp:align>left</wp:align>
+            </wp:positionH>
+            <wp:positionV relativeFrom="paragraph">
+              <wp:posOffset>523875</wp:posOffset>
+            </wp:positionV>
+            <wp:extent cx="7617460" cy="4714875"/>
+            <wp:effectExtent l="0" t="0" r="2540" b="9525"/>
+            <wp:wrapTopAndBottom/>
+            <wp:docPr id="7" name="Imagem 7"/>
+            <wp:cNvGraphicFramePr>
+              <a:graphicFrameLocks xmlns:a="http://schemas.openxmlformats.org/drawingml/2006/main" noChangeAspect="1"/>
+            </wp:cNvGraphicFramePr>
+            <a:graphic xmlns:a="http://schemas.openxmlformats.org/drawingml/2006/main">
+              <a:graphicData uri="http://schemas.openxmlformats.org/drawingml/2006/picture">
+                <pic:pic xmlns:pic="http://schemas.openxmlformats.org/drawingml/2006/picture">
+                  <pic:nvPicPr>
+                    <pic:cNvPr id="0" name="Picture 1"/>
+                    <pic:cNvPicPr>
+                      <a:picLocks noChangeAspect="1" noChangeArrowheads="1"/>
+                    </pic:cNvPicPr>
+                  </pic:nvPicPr>
+                  <pic:blipFill>
+                    <a:blip r:embed="rId13">
+                      <a:extLst>
+                        <a:ext uri="{28A0092B-C50C-407E-A947-70E740481C1C}">
+                          <a14:useLocalDpi xmlns:a14="http://schemas.microsoft.com/office/drawing/2010/main" val="0"/>
+                        </a:ext>
+                      </a:extLst>
+                    </a:blip>
+                    <a:srcRect/>
+                    <a:stretch>
+                      <a:fillRect/>
+                    </a:stretch>
+                  </pic:blipFill>
+                  <pic:spPr bwMode="auto">
+                    <a:xfrm>
+                      <a:off x="0" y="0"/>
+                      <a:ext cx="7627228" cy="4721169"/>
+                    </a:xfrm>
+                    <a:prstGeom prst="rect">
+                      <a:avLst/>
+                    </a:prstGeom>
+                    <a:noFill/>
+                    <a:ln>
+                      <a:noFill/>
+                    </a:ln>
+                  </pic:spPr>
+                </pic:pic>
+              </a:graphicData>
+            </a:graphic>
+            <wp14:sizeRelH relativeFrom="margin">
+              <wp14:pctWidth>0</wp14:pctWidth>
+            </wp14:sizeRelH>
+            <wp14:sizeRelV relativeFrom="margin">
+              <wp14:pctHeight>0</wp14:pctHeight>
+            </wp14:sizeRelV>
+          </wp:anchor>
+        </w:drawing>
+      </w:r>
+    </w:p>
+    <w:p>
+      <w:pPr>
+        <w:spacing w:before="100" w:beforeAutospacing="1" w:after="100" w:afterAutospacing="1" w:line="240" w:lineRule="auto"/>
+        <w:jc w:val="left"/>
+        <w:rPr>
+          <w:rFonts w:ascii="Times New Roman" w:eastAsia="Times New Roman" w:hAnsi="Times New Roman" w:cs="Times New Roman"/>
+          <w:sz w:val="24"/>
+          <w:szCs w:val="24"/>
+        </w:rPr>
+      </w:pPr>
+    </w:p>
+    <w:p/>
+    <w:p/>
+    <w:p/>
+    <w:p/>
+    <w:p/>
+    <w:p/>
+    <w:p/>
+    <w:p/>
+    <w:p/>
+    <w:p/>
+    <w:p/>
+    <w:p/>
+    <w:p/>
+    <w:p>
+      <w:pPr>
+        <w:pStyle w:val="Ttulo2"/>
+        <w:ind w:left="426" w:hanging="426"/>
+      </w:pPr>
+      <w:bookmarkStart w:id="9" w:name="_Toc228442937"/>
+      <w:r>
+        <w:lastRenderedPageBreak/>
+        <w:t>1.6 Diagramas UML</w:t>
+      </w:r>
+      <w:bookmarkEnd w:id="9"/>
+    </w:p>
+    <w:p/>
+    <w:p>
+      <w:pPr>
+        <w:pStyle w:val="Ttulo2"/>
+        <w:ind w:left="426" w:hanging="426"/>
+      </w:pPr>
+      <w:bookmarkStart w:id="10" w:name="_Toc228442938"/>
+      <w:r>
+        <w:t>1.</w:t>
+      </w:r>
+      <w:r>
+        <w:t>7</w:t>
+      </w:r>
+      <w:r>
+        <w:t xml:space="preserve"> </w:t>
+      </w:r>
+      <w:r>
+        <w:rPr>
+          <w:i/>
+          <w:iCs/>
+        </w:rPr>
+        <w:t>Backlog</w:t>
+      </w:r>
+      <w:r>
+        <w:t xml:space="preserve"> do Produto</w:t>
+      </w:r>
+      <w:bookmarkEnd w:id="10"/>
+    </w:p>
+    <w:p>
+      <w:pPr>
+        <w:rPr>
+          <w:sz w:val="24"/>
+          <w:szCs w:val="24"/>
+        </w:rPr>
+      </w:pPr>
+      <w:bookmarkStart w:id="11" w:name="_e6ygphsuszjk" w:colFirst="0" w:colLast="0"/>
+      <w:bookmarkStart w:id="12" w:name="_f7jgtdjz4z44" w:colFirst="0" w:colLast="0"/>
+      <w:bookmarkEnd w:id="11"/>
+      <w:bookmarkEnd w:id="12"/>
+      <w:r>
+        <w:rPr>
+          <w:sz w:val="24"/>
+          <w:szCs w:val="24"/>
+        </w:rPr>
+        <w:t>Apresentar o backlog do produto conforme definido na ferramenta de software</w:t>
+      </w:r>
+      <w:r>
+        <w:rPr>
+          <w:sz w:val="24"/>
+          <w:szCs w:val="24"/>
+        </w:rPr>
+        <w:t xml:space="preserve"> (</w:t>
+      </w:r>
+      <w:proofErr w:type="spellStart"/>
+      <w:r>
+        <w:rPr>
+          <w:sz w:val="24"/>
+          <w:szCs w:val="24"/>
+        </w:rPr>
+        <w:t>Trello</w:t>
+      </w:r>
+      <w:proofErr w:type="spellEnd"/>
+      <w:r>
+        <w:rPr>
+          <w:sz w:val="24"/>
+          <w:szCs w:val="24"/>
+        </w:rPr>
+        <w:t>, por exemplo). Atenção que esta etapa exige que seja apresentado todo o escopo distribuído em requisitos funcionais e não funcionais em formato de estórias de usuário.</w:t>
+      </w:r>
+    </w:p>
+    <w:p>
+      <w:pPr>
+        <w:rPr>
+          <w:sz w:val="24"/>
+          <w:szCs w:val="24"/>
+        </w:rPr>
+      </w:pPr>
+    </w:p>
     <w:p>
       <w:pPr>
         <w:spacing w:after="240"/>
@@ -4661,34 +4949,25 @@
           <w:sz w:val="24"/>
           <w:szCs w:val="24"/>
         </w:rPr>
-        <w:t>Sugestão de bibliografia</w:t>
-      </w:r>
-      <w:r>
+        <w:t>Sugestão de bibliografia:</w:t>
+      </w:r>
+    </w:p>
+    <w:p>
+      <w:pPr>
+        <w:spacing w:after="240"/>
         <w:rPr>
           <w:color w:val="A6A6A6" w:themeColor="background1" w:themeShade="A6"/>
           <w:sz w:val="24"/>
           <w:szCs w:val="24"/>
         </w:rPr>
-        <w:t>:</w:t>
-      </w:r>
-    </w:p>
-    <w:p>
-      <w:pPr>
-        <w:spacing w:after="240"/>
+      </w:pPr>
+      <w:r>
         <w:rPr>
           <w:color w:val="A6A6A6" w:themeColor="background1" w:themeShade="A6"/>
           <w:sz w:val="24"/>
           <w:szCs w:val="24"/>
         </w:rPr>
-      </w:pPr>
-      <w:bookmarkStart w:id="8" w:name="_Hlk156896231"/>
-      <w:r>
-        <w:rPr>
-          <w:color w:val="A6A6A6" w:themeColor="background1" w:themeShade="A6"/>
-          <w:sz w:val="24"/>
-          <w:szCs w:val="24"/>
-        </w:rPr>
-        <w:t xml:space="preserve">CAMARGO, R. </w:t>
+        <w:t xml:space="preserve">MATSUMOTO, Mayra, </w:t>
       </w:r>
       <w:r>
         <w:rPr>
@@ -4698,7 +4977,7 @@
           <w:sz w:val="24"/>
           <w:szCs w:val="24"/>
         </w:rPr>
-        <w:t>PM Visual</w:t>
+        <w:t>MVP</w:t>
       </w:r>
       <w:r>
         <w:rPr>
@@ -4706,10 +4985,9 @@
           <w:sz w:val="24"/>
           <w:szCs w:val="24"/>
         </w:rPr>
-        <w:t xml:space="preserve">: Project Model Visual – Gestão de projetos simples e eficaz. 2. ed. São Paulo: Saraiva Educação, 2019. </w:t>
-      </w:r>
-    </w:p>
-    <w:bookmarkEnd w:id="8"/>
+        <w:t>: a forma eficiente de criar, validar e comercializar um novo produto ou serviço, Kindle: Amazon.com, 2020.</w:t>
+      </w:r>
+    </w:p>
     <w:p>
       <w:pPr>
         <w:spacing w:after="240"/>
@@ -4725,52 +5003,7 @@
           <w:sz w:val="24"/>
           <w:szCs w:val="24"/>
         </w:rPr>
-        <w:t xml:space="preserve">OSTERWALDER, A. </w:t>
-      </w:r>
-      <w:r>
-        <w:rPr>
-          <w:b/>
-          <w:color w:val="A6A6A6" w:themeColor="background1" w:themeShade="A6"/>
-          <w:sz w:val="24"/>
-          <w:szCs w:val="24"/>
-          <w:lang w:val="pt-PT"/>
-        </w:rPr>
-        <w:t>Business model generation: inovação em modelos de negócios</w:t>
-      </w:r>
-      <w:r>
-        <w:rPr>
-          <w:color w:val="A6A6A6" w:themeColor="background1" w:themeShade="A6"/>
-          <w:sz w:val="24"/>
-          <w:szCs w:val="24"/>
-          <w:lang w:val="pt-PT"/>
-        </w:rPr>
-        <w:t xml:space="preserve">. </w:t>
-      </w:r>
-      <w:r>
-        <w:rPr>
-          <w:color w:val="A6A6A6" w:themeColor="background1" w:themeShade="A6"/>
-          <w:sz w:val="24"/>
-          <w:szCs w:val="24"/>
-        </w:rPr>
-        <w:t>Rio de Janeiro: Editora Alta Books, 2011.</w:t>
-      </w:r>
-    </w:p>
-    <w:p>
-      <w:pPr>
-        <w:spacing w:after="240"/>
-        <w:rPr>
-          <w:color w:val="A6A6A6" w:themeColor="background1" w:themeShade="A6"/>
-          <w:sz w:val="24"/>
-          <w:szCs w:val="24"/>
-        </w:rPr>
-      </w:pPr>
-      <w:r>
-        <w:rPr>
-          <w:color w:val="A6A6A6" w:themeColor="background1" w:themeShade="A6"/>
-          <w:sz w:val="24"/>
-          <w:szCs w:val="24"/>
-        </w:rPr>
-        <w:t xml:space="preserve">SEBRAE, </w:t>
+        <w:t xml:space="preserve">SUTHERLAND, J. </w:t>
       </w:r>
       <w:r>
         <w:rPr>
@@ -4780,7 +5013,7 @@
           <w:sz w:val="24"/>
           <w:szCs w:val="24"/>
         </w:rPr>
-        <w:t>CANVAS: Como estruturar seu modelo de negócio</w:t>
+        <w:t>Scrum</w:t>
       </w:r>
       <w:r>
         <w:rPr>
@@ -4788,589 +5021,19 @@
           <w:sz w:val="24"/>
           <w:szCs w:val="24"/>
         </w:rPr>
-        <w:t>. SEBRAEPR</w:t>
-      </w:r>
-      <w:r>
-        <w:rPr>
-          <w:b/>
+        <w:t>: a arte de fazer o dobro do trabalho na metade do tempo. Rio de Janeiro: Sextante, 2019.</w:t>
+      </w:r>
+    </w:p>
+    <w:p>
+      <w:pPr>
+        <w:spacing w:after="240"/>
+        <w:rPr>
           <w:color w:val="A6A6A6" w:themeColor="background1" w:themeShade="A6"/>
           <w:sz w:val="24"/>
           <w:szCs w:val="24"/>
         </w:rPr>
-        <w:t xml:space="preserve">, </w:t>
-      </w:r>
-      <w:r>
-        <w:rPr>
-          <w:color w:val="A6A6A6" w:themeColor="background1" w:themeShade="A6"/>
-          <w:sz w:val="24"/>
-          <w:szCs w:val="24"/>
-        </w:rPr>
-        <w:t xml:space="preserve">2024. Disponível em: </w:t>
-      </w:r>
-      <w:hyperlink r:id="rId12" w:history="1">
-        <w:r>
-          <w:rPr>
-            <w:rStyle w:val="Hyperlink"/>
-            <w:color w:val="A6A6A6" w:themeColor="background1" w:themeShade="A6"/>
-            <w:sz w:val="24"/>
-            <w:szCs w:val="24"/>
-          </w:rPr>
-          <w:t>https://www.sebraepr.com.br/canvas-como-estruturar-seu-modelo-de-negocios/</w:t>
-        </w:r>
-      </w:hyperlink>
-      <w:r>
-        <w:rPr>
-          <w:color w:val="A6A6A6" w:themeColor="background1" w:themeShade="A6"/>
-          <w:sz w:val="24"/>
-          <w:szCs w:val="24"/>
-        </w:rPr>
-        <w:t>. Acesso em: 25 maio 2024.</w:t>
-      </w:r>
-    </w:p>
-    <w:p/>
-    <w:p>
-      <w:pPr>
-        <w:pStyle w:val="Ttulo2"/>
-        <w:ind w:left="426" w:hanging="426"/>
-      </w:pPr>
-      <w:bookmarkStart w:id="9" w:name="_Toc228442936"/>
-      <w:r>
-        <w:t>1.</w:t>
-      </w:r>
-      <w:r>
-        <w:t>5</w:t>
-      </w:r>
-      <w:r>
-        <w:t xml:space="preserve"> Mapa mental do sistema</w:t>
-      </w:r>
-      <w:bookmarkEnd w:id="9"/>
-    </w:p>
-    <w:p/>
-    <w:p>
-      <w:r>
-        <w:t>Elaborar um mapa mental do projeto</w:t>
-      </w:r>
-    </w:p>
-    <w:p>
-      <w:pPr>
-        <w:spacing w:after="240"/>
-        <w:rPr>
-          <w:color w:val="A6A6A6" w:themeColor="background1" w:themeShade="A6"/>
-          <w:sz w:val="24"/>
-          <w:szCs w:val="24"/>
-        </w:rPr>
-      </w:pPr>
-    </w:p>
-    <w:p>
-      <w:pPr>
-        <w:spacing w:after="240"/>
-        <w:rPr>
-          <w:color w:val="A6A6A6" w:themeColor="background1" w:themeShade="A6"/>
-          <w:sz w:val="24"/>
-          <w:szCs w:val="24"/>
-        </w:rPr>
-      </w:pPr>
-      <w:r>
-        <w:rPr>
-          <w:color w:val="A6A6A6" w:themeColor="background1" w:themeShade="A6"/>
-          <w:sz w:val="24"/>
-          <w:szCs w:val="24"/>
-        </w:rPr>
-        <w:t>Sugestão de bibliografia:</w:t>
-      </w:r>
-    </w:p>
-    <w:p>
-      <w:pPr>
-        <w:spacing w:after="240"/>
-        <w:rPr>
-          <w:color w:val="A6A6A6" w:themeColor="background1" w:themeShade="A6"/>
-          <w:sz w:val="24"/>
-          <w:szCs w:val="24"/>
-        </w:rPr>
-      </w:pPr>
-      <w:r>
-        <w:rPr>
-          <w:color w:val="A6A6A6" w:themeColor="background1" w:themeShade="A6"/>
-          <w:sz w:val="24"/>
-          <w:szCs w:val="24"/>
-          <w:lang w:val="pt-PT"/>
-        </w:rPr>
-        <w:t xml:space="preserve">BUZAN, T. </w:t>
-      </w:r>
-      <w:r>
-        <w:rPr>
-          <w:b/>
-          <w:color w:val="A6A6A6" w:themeColor="background1" w:themeShade="A6"/>
-          <w:sz w:val="24"/>
-          <w:szCs w:val="24"/>
-          <w:lang w:val="pt-PT"/>
-        </w:rPr>
-        <w:t>Mapas Mentais Para os Negócios</w:t>
-      </w:r>
-      <w:r>
-        <w:rPr>
-          <w:color w:val="A6A6A6" w:themeColor="background1" w:themeShade="A6"/>
-          <w:sz w:val="24"/>
-          <w:szCs w:val="24"/>
-          <w:lang w:val="pt-PT"/>
-        </w:rPr>
-        <w:t xml:space="preserve">: Revolucione Sua Atividade Empresarial e a Maneira Como Você Trabalha. </w:t>
-      </w:r>
-      <w:r>
-        <w:rPr>
-          <w:color w:val="A6A6A6" w:themeColor="background1" w:themeShade="A6"/>
-          <w:sz w:val="24"/>
-          <w:szCs w:val="24"/>
-        </w:rPr>
-        <w:t xml:space="preserve">São Paulo: </w:t>
-      </w:r>
-      <w:proofErr w:type="spellStart"/>
-      <w:r>
-        <w:rPr>
-          <w:color w:val="A6A6A6" w:themeColor="background1" w:themeShade="A6"/>
-          <w:sz w:val="24"/>
-          <w:szCs w:val="24"/>
-        </w:rPr>
-        <w:t>Cultrix</w:t>
-      </w:r>
-      <w:proofErr w:type="spellEnd"/>
-      <w:r>
-        <w:rPr>
-          <w:color w:val="A6A6A6" w:themeColor="background1" w:themeShade="A6"/>
-          <w:sz w:val="24"/>
-          <w:szCs w:val="24"/>
-        </w:rPr>
-        <w:t>, 2017.</w:t>
-      </w:r>
-    </w:p>
-    <w:p>
-      <w:pPr>
-        <w:spacing w:after="240"/>
-        <w:rPr>
-          <w:color w:val="A6A6A6" w:themeColor="background1" w:themeShade="A6"/>
-          <w:sz w:val="24"/>
-          <w:szCs w:val="24"/>
-        </w:rPr>
-      </w:pPr>
-      <w:r>
-        <w:rPr>
-          <w:color w:val="A6A6A6" w:themeColor="background1" w:themeShade="A6"/>
-          <w:sz w:val="24"/>
-          <w:szCs w:val="24"/>
-        </w:rPr>
-        <w:t xml:space="preserve">CAMARGO, R. </w:t>
-      </w:r>
-      <w:r>
-        <w:rPr>
-          <w:b/>
-          <w:bCs/>
-          <w:color w:val="A6A6A6" w:themeColor="background1" w:themeShade="A6"/>
-          <w:sz w:val="24"/>
-          <w:szCs w:val="24"/>
-        </w:rPr>
-        <w:t>PM Visual</w:t>
-      </w:r>
-      <w:r>
-        <w:rPr>
-          <w:color w:val="A6A6A6" w:themeColor="background1" w:themeShade="A6"/>
-          <w:sz w:val="24"/>
-          <w:szCs w:val="24"/>
-        </w:rPr>
-        <w:t xml:space="preserve">: Project Model Visual – Gestão de projetos simples e eficaz. 2. ed. São Paulo: Saraiva Educação, 2019. </w:t>
-      </w:r>
-    </w:p>
-    <w:p/>
-    <w:p>
-      <w:pPr>
-        <w:pStyle w:val="Ttulo2"/>
-        <w:ind w:left="426" w:hanging="426"/>
-      </w:pPr>
-      <w:bookmarkStart w:id="10" w:name="_Toc228442937"/>
-      <w:r>
-        <w:t>1.6 Diagramas UML</w:t>
-      </w:r>
-      <w:bookmarkEnd w:id="10"/>
-    </w:p>
-    <w:p/>
-    <w:p>
-      <w:pPr>
-        <w:pStyle w:val="Ttulo2"/>
-        <w:ind w:left="426" w:hanging="426"/>
-      </w:pPr>
-      <w:bookmarkStart w:id="11" w:name="_Toc228442938"/>
-      <w:r>
-        <w:t>1.</w:t>
-      </w:r>
-      <w:r>
-        <w:t>7</w:t>
-      </w:r>
-      <w:r>
-        <w:t xml:space="preserve"> </w:t>
-      </w:r>
-      <w:r>
-        <w:rPr>
-          <w:i/>
-          <w:iCs/>
-        </w:rPr>
-        <w:t>Backlog</w:t>
-      </w:r>
-      <w:r>
-        <w:t xml:space="preserve"> do Produto</w:t>
-      </w:r>
-      <w:bookmarkEnd w:id="11"/>
-    </w:p>
-    <w:p>
-      <w:pPr>
-        <w:rPr>
-          <w:sz w:val="24"/>
-          <w:szCs w:val="24"/>
-        </w:rPr>
-      </w:pPr>
-      <w:bookmarkStart w:id="12" w:name="_e6ygphsuszjk" w:colFirst="0" w:colLast="0"/>
-      <w:bookmarkStart w:id="13" w:name="_f7jgtdjz4z44" w:colFirst="0" w:colLast="0"/>
-      <w:bookmarkEnd w:id="12"/>
-      <w:bookmarkEnd w:id="13"/>
-      <w:r>
-        <w:rPr>
-          <w:sz w:val="24"/>
-          <w:szCs w:val="24"/>
-        </w:rPr>
-        <w:t>Apresentar o backlog do produto conforme definido na ferramenta de software</w:t>
-      </w:r>
-      <w:r>
-        <w:rPr>
-          <w:sz w:val="24"/>
-          <w:szCs w:val="24"/>
-        </w:rPr>
-        <w:t xml:space="preserve"> (</w:t>
-      </w:r>
-      <w:proofErr w:type="spellStart"/>
-      <w:r>
-        <w:rPr>
-          <w:sz w:val="24"/>
-          <w:szCs w:val="24"/>
-        </w:rPr>
-        <w:t>Trello</w:t>
-      </w:r>
-      <w:proofErr w:type="spellEnd"/>
-      <w:r>
-        <w:rPr>
-          <w:sz w:val="24"/>
-          <w:szCs w:val="24"/>
-        </w:rPr>
-        <w:t>, por exemplo). Atenção que esta etapa exige que seja apresentado todo o escopo distribuído em requisitos funcionais e não funcionais em formato de estórias de usuário.</w:t>
-      </w:r>
-    </w:p>
-    <w:p>
-      <w:pPr>
-        <w:rPr>
-          <w:sz w:val="24"/>
-          <w:szCs w:val="24"/>
-        </w:rPr>
-      </w:pPr>
-    </w:p>
-    <w:p>
-      <w:pPr>
-        <w:spacing w:after="240"/>
-        <w:rPr>
-          <w:color w:val="A6A6A6" w:themeColor="background1" w:themeShade="A6"/>
-          <w:sz w:val="24"/>
-          <w:szCs w:val="24"/>
-        </w:rPr>
-      </w:pPr>
-      <w:r>
-        <w:rPr>
-          <w:color w:val="A6A6A6" w:themeColor="background1" w:themeShade="A6"/>
-          <w:sz w:val="24"/>
-          <w:szCs w:val="24"/>
-        </w:rPr>
-        <w:t>Sugestão de bibliografia:</w:t>
-      </w:r>
-    </w:p>
-    <w:p>
-      <w:pPr>
-        <w:spacing w:after="240"/>
-        <w:rPr>
-          <w:color w:val="A6A6A6" w:themeColor="background1" w:themeShade="A6"/>
-          <w:sz w:val="24"/>
-          <w:szCs w:val="24"/>
-        </w:rPr>
-      </w:pPr>
-      <w:r>
-        <w:rPr>
-          <w:color w:val="A6A6A6" w:themeColor="background1" w:themeShade="A6"/>
-          <w:sz w:val="24"/>
-          <w:szCs w:val="24"/>
-        </w:rPr>
-        <w:t xml:space="preserve">MATSUMOTO, Mayra, </w:t>
-      </w:r>
-      <w:r>
-        <w:rPr>
-          <w:b/>
-          <w:bCs/>
-          <w:color w:val="A6A6A6" w:themeColor="background1" w:themeShade="A6"/>
-          <w:sz w:val="24"/>
-          <w:szCs w:val="24"/>
-        </w:rPr>
-        <w:t>MVP</w:t>
-      </w:r>
-      <w:r>
-        <w:rPr>
-          <w:color w:val="A6A6A6" w:themeColor="background1" w:themeShade="A6"/>
-          <w:sz w:val="24"/>
-          <w:szCs w:val="24"/>
-        </w:rPr>
-        <w:t>: a forma eficiente de criar, validar e comercializar um novo produto ou serviço, Kindle: Amazon.com, 2020.</w:t>
-      </w:r>
-    </w:p>
-    <w:p>
-      <w:pPr>
-        <w:spacing w:after="240"/>
-        <w:rPr>
-          <w:color w:val="A6A6A6" w:themeColor="background1" w:themeShade="A6"/>
-          <w:sz w:val="24"/>
-          <w:szCs w:val="24"/>
-        </w:rPr>
-      </w:pPr>
-      <w:r>
-        <w:rPr>
-          <w:color w:val="A6A6A6" w:themeColor="background1" w:themeShade="A6"/>
-          <w:sz w:val="24"/>
-          <w:szCs w:val="24"/>
-        </w:rPr>
-        <w:t xml:space="preserve">SUTHERLAND, J. </w:t>
-      </w:r>
-      <w:r>
-        <w:rPr>
-          <w:b/>
-          <w:bCs/>
-          <w:color w:val="A6A6A6" w:themeColor="background1" w:themeShade="A6"/>
-          <w:sz w:val="24"/>
-          <w:szCs w:val="24"/>
-        </w:rPr>
-        <w:t>Scrum</w:t>
-      </w:r>
-      <w:r>
-        <w:rPr>
-          <w:color w:val="A6A6A6" w:themeColor="background1" w:themeShade="A6"/>
-          <w:sz w:val="24"/>
-          <w:szCs w:val="24"/>
-        </w:rPr>
-        <w:t>: a arte de fazer o dobro do trabalho na metade do tempo. Rio de Janeiro: Sextante, 2019.</w:t>
-      </w:r>
-    </w:p>
-    <w:p>
-      <w:pPr>
-        <w:spacing w:after="240"/>
-        <w:rPr>
-          <w:color w:val="A6A6A6" w:themeColor="background1" w:themeShade="A6"/>
-          <w:sz w:val="24"/>
-          <w:szCs w:val="24"/>
-        </w:rPr>
-      </w:pPr>
-      <w:bookmarkStart w:id="14" w:name="_Hlk80775798"/>
-      <w:r>
-        <w:rPr>
-          <w:color w:val="A6A6A6" w:themeColor="background1" w:themeShade="A6"/>
-          <w:sz w:val="24"/>
-          <w:szCs w:val="24"/>
-        </w:rPr>
-        <w:t xml:space="preserve">SCRUMSTUDY, </w:t>
-      </w:r>
-      <w:r>
-        <w:rPr>
-          <w:b/>
-          <w:bCs/>
-          <w:color w:val="A6A6A6" w:themeColor="background1" w:themeShade="A6"/>
-          <w:sz w:val="24"/>
-          <w:szCs w:val="24"/>
-        </w:rPr>
-        <w:t>Guia SBOK: Guia para o Conhecimento em Scrum</w:t>
-      </w:r>
-      <w:r>
-        <w:rPr>
-          <w:color w:val="A6A6A6" w:themeColor="background1" w:themeShade="A6"/>
-          <w:sz w:val="24"/>
-          <w:szCs w:val="24"/>
-        </w:rPr>
-        <w:t xml:space="preserve">, Arizona, EUA: </w:t>
-      </w:r>
-      <w:proofErr w:type="spellStart"/>
-      <w:r>
-        <w:rPr>
-          <w:color w:val="A6A6A6" w:themeColor="background1" w:themeShade="A6"/>
-          <w:sz w:val="24"/>
-          <w:szCs w:val="24"/>
-        </w:rPr>
-        <w:t>SCRUMstudy</w:t>
-      </w:r>
-      <w:proofErr w:type="spellEnd"/>
-      <w:r>
-        <w:rPr>
-          <w:color w:val="A6A6A6" w:themeColor="background1" w:themeShade="A6"/>
-          <w:sz w:val="24"/>
-          <w:szCs w:val="24"/>
-        </w:rPr>
-        <w:t xml:space="preserve">, 2016. </w:t>
-      </w:r>
-      <w:hyperlink r:id="rId13" w:history="1">
-        <w:r>
-          <w:rPr>
-            <w:color w:val="A6A6A6" w:themeColor="background1" w:themeShade="A6"/>
-          </w:rPr>
-          <w:t>https://www.Scrumstudy.com/SBOK/SCRUMstudy-SBOK-Guide-2016-Portuguese.pdf</w:t>
-        </w:r>
-      </w:hyperlink>
-      <w:r>
-        <w:rPr>
-          <w:color w:val="A6A6A6" w:themeColor="background1" w:themeShade="A6"/>
-          <w:sz w:val="24"/>
-          <w:szCs w:val="24"/>
-        </w:rPr>
-        <w:t>. Acesso em: 08 mar. 202</w:t>
-      </w:r>
-      <w:r>
-        <w:rPr>
-          <w:color w:val="A6A6A6" w:themeColor="background1" w:themeShade="A6"/>
-          <w:sz w:val="24"/>
-          <w:szCs w:val="24"/>
-        </w:rPr>
-        <w:t>4</w:t>
-      </w:r>
-      <w:r>
-        <w:rPr>
-          <w:color w:val="A6A6A6" w:themeColor="background1" w:themeShade="A6"/>
-          <w:sz w:val="24"/>
-          <w:szCs w:val="24"/>
-        </w:rPr>
-        <w:t>.</w:t>
-      </w:r>
-    </w:p>
-    <w:bookmarkEnd w:id="14"/>
-    <w:p>
-      <w:pPr>
-        <w:rPr>
-          <w:b/>
-          <w:color w:val="A6A6A6" w:themeColor="background1" w:themeShade="A6"/>
-          <w:sz w:val="24"/>
-          <w:szCs w:val="24"/>
-        </w:rPr>
-      </w:pPr>
-    </w:p>
-    <w:p>
-      <w:pPr>
-        <w:pStyle w:val="Ttulo2"/>
-        <w:ind w:left="426" w:hanging="426"/>
-      </w:pPr>
-      <w:bookmarkStart w:id="15" w:name="_Toc228442939"/>
-      <w:r>
-        <w:t>1.</w:t>
-      </w:r>
-      <w:r>
-        <w:t>8</w:t>
-      </w:r>
-      <w:r>
-        <w:t xml:space="preserve"> </w:t>
-      </w:r>
-      <w:r>
-        <w:rPr>
-          <w:i/>
-          <w:iCs/>
-        </w:rPr>
-        <w:t>Backlog</w:t>
-      </w:r>
-      <w:r>
-        <w:t xml:space="preserve"> dos </w:t>
-      </w:r>
-      <w:r>
-        <w:rPr>
-          <w:i/>
-          <w:iCs/>
-        </w:rPr>
-        <w:t>Sprints</w:t>
-      </w:r>
-      <w:bookmarkEnd w:id="15"/>
-    </w:p>
-    <w:p/>
-    <w:p>
-      <w:r>
-        <w:t xml:space="preserve">Apresentar o </w:t>
-      </w:r>
-      <w:r>
-        <w:rPr>
-          <w:i/>
-          <w:iCs/>
-        </w:rPr>
-        <w:t xml:space="preserve">Backlog </w:t>
-      </w:r>
-      <w:r>
-        <w:t>dos Sprints conforme desenvolvido nas seis semanas de atividades de planejamento e desenvolvimento do projeto.</w:t>
-      </w:r>
-    </w:p>
-    <w:p/>
-    <w:p>
-      <w:pPr>
-        <w:spacing w:after="240"/>
-        <w:rPr>
-          <w:color w:val="A6A6A6" w:themeColor="background1" w:themeShade="A6"/>
-          <w:sz w:val="24"/>
-          <w:szCs w:val="24"/>
-        </w:rPr>
-      </w:pPr>
-      <w:r>
-        <w:rPr>
-          <w:color w:val="A6A6A6" w:themeColor="background1" w:themeShade="A6"/>
-          <w:sz w:val="24"/>
-          <w:szCs w:val="24"/>
-        </w:rPr>
-        <w:t>Sugestão de bibliografia:</w:t>
-      </w:r>
-    </w:p>
-    <w:p>
-      <w:pPr>
-        <w:spacing w:after="240"/>
-        <w:rPr>
-          <w:color w:val="A6A6A6" w:themeColor="background1" w:themeShade="A6"/>
-          <w:sz w:val="24"/>
-          <w:szCs w:val="24"/>
-        </w:rPr>
-      </w:pPr>
-      <w:r>
-        <w:rPr>
-          <w:color w:val="A6A6A6" w:themeColor="background1" w:themeShade="A6"/>
-          <w:sz w:val="24"/>
-          <w:szCs w:val="24"/>
-        </w:rPr>
-        <w:t xml:space="preserve">SUTHERLAND, J. </w:t>
-      </w:r>
-      <w:r>
-        <w:rPr>
-          <w:b/>
-          <w:bCs/>
-          <w:color w:val="A6A6A6" w:themeColor="background1" w:themeShade="A6"/>
-          <w:sz w:val="24"/>
-          <w:szCs w:val="24"/>
-        </w:rPr>
-        <w:t>Scrum</w:t>
-      </w:r>
-      <w:r>
-        <w:rPr>
-          <w:color w:val="A6A6A6" w:themeColor="background1" w:themeShade="A6"/>
-          <w:sz w:val="24"/>
-          <w:szCs w:val="24"/>
-        </w:rPr>
-        <w:t>: a arte de fazer o dobro do trabalho na metade do tempo. Rio de Janeiro: Sextante, 2019.</w:t>
-      </w:r>
-    </w:p>
-    <w:p>
-      <w:pPr>
-        <w:spacing w:after="240"/>
-        <w:rPr>
-          <w:color w:val="A6A6A6" w:themeColor="background1" w:themeShade="A6"/>
-          <w:sz w:val="24"/>
-          <w:szCs w:val="24"/>
-        </w:rPr>
-      </w:pPr>
+      </w:pPr>
+      <w:bookmarkStart w:id="13" w:name="_Hlk80775798"/>
       <w:r>
         <w:rPr>
           <w:color w:val="A6A6A6" w:themeColor="background1" w:themeShade="A6"/>
@@ -5448,91 +5111,69 @@
         <w:t>.</w:t>
       </w:r>
     </w:p>
-    <w:p/>
-    <w:p/>
+    <w:bookmarkEnd w:id="13"/>
+    <w:p>
+      <w:pPr>
+        <w:rPr>
+          <w:b/>
+          <w:color w:val="A6A6A6" w:themeColor="background1" w:themeShade="A6"/>
+          <w:sz w:val="24"/>
+          <w:szCs w:val="24"/>
+        </w:rPr>
+      </w:pPr>
+    </w:p>
     <w:p>
       <w:pPr>
         <w:pStyle w:val="Ttulo2"/>
         <w:ind w:left="426" w:hanging="426"/>
       </w:pPr>
-      <w:bookmarkStart w:id="16" w:name="_Toc228442940"/>
+      <w:bookmarkStart w:id="14" w:name="_Toc228442939"/>
       <w:r>
         <w:t>1.</w:t>
       </w:r>
       <w:r>
-        <w:t>9</w:t>
+        <w:t>8</w:t>
       </w:r>
       <w:r>
         <w:t xml:space="preserve"> </w:t>
       </w:r>
-      <w:r>
-        <w:t xml:space="preserve">Entregáveis – </w:t>
-      </w:r>
-      <w:proofErr w:type="spellStart"/>
       <w:r>
         <w:rPr>
           <w:i/>
           <w:iCs/>
         </w:rPr>
-        <w:t>Minimum</w:t>
-      </w:r>
-      <w:proofErr w:type="spellEnd"/>
+        <w:t>Backlog</w:t>
+      </w:r>
+      <w:r>
+        <w:t xml:space="preserve"> dos </w:t>
+      </w:r>
       <w:r>
         <w:rPr>
           <w:i/>
           <w:iCs/>
         </w:rPr>
-        <w:t xml:space="preserve"> </w:t>
-      </w:r>
-      <w:proofErr w:type="spellStart"/>
+        <w:t>Sprints</w:t>
+      </w:r>
+      <w:bookmarkEnd w:id="14"/>
+    </w:p>
+    <w:p/>
+    <w:p>
+      <w:r>
+        <w:t xml:space="preserve">Apresentar o </w:t>
+      </w:r>
       <w:r>
         <w:rPr>
           <w:i/>
           <w:iCs/>
         </w:rPr>
-        <w:t>Viable</w:t>
-      </w:r>
-      <w:proofErr w:type="spellEnd"/>
-      <w:r>
-        <w:rPr>
-          <w:i/>
-          <w:iCs/>
-        </w:rPr>
-        <w:t xml:space="preserve"> </w:t>
-      </w:r>
-      <w:proofErr w:type="spellStart"/>
-      <w:r>
-        <w:rPr>
-          <w:i/>
-          <w:iCs/>
-        </w:rPr>
-        <w:t>Product</w:t>
-      </w:r>
-      <w:proofErr w:type="spellEnd"/>
-      <w:r>
-        <w:t xml:space="preserve"> (MVP)</w:t>
-      </w:r>
-      <w:bookmarkEnd w:id="16"/>
+        <w:t xml:space="preserve">Backlog </w:t>
+      </w:r>
+      <w:r>
+        <w:t>dos Sprints conforme desenvolvido nas seis semanas de atividades de planejamento e desenvolvimento do projeto.</w:t>
+      </w:r>
     </w:p>
     <w:p/>
     <w:p>
-      <w:r>
-        <w:t xml:space="preserve">Apresentar </w:t>
-      </w:r>
-      <w:r>
-        <w:t xml:space="preserve">as diferentes versões dos </w:t>
-      </w:r>
-      <w:proofErr w:type="spellStart"/>
-      <w:r>
-        <w:t>MVPs</w:t>
-      </w:r>
-      <w:proofErr w:type="spellEnd"/>
-      <w:r>
-        <w:t xml:space="preserve"> do produto em formato de entregáveis realizados durante as seis semanas de atividades do projeto.</w:t>
-      </w:r>
-    </w:p>
-    <w:p/>
-    <w:p>
       <w:pPr>
         <w:spacing w:after="240"/>
         <w:rPr>
@@ -5565,132 +5206,6 @@
           <w:sz w:val="24"/>
           <w:szCs w:val="24"/>
         </w:rPr>
-        <w:t xml:space="preserve">MATSUMOTO, Mayra, </w:t>
-      </w:r>
-      <w:r>
-        <w:rPr>
-          <w:b/>
-          <w:bCs/>
-          <w:color w:val="A6A6A6" w:themeColor="background1" w:themeShade="A6"/>
-          <w:sz w:val="24"/>
-          <w:szCs w:val="24"/>
-        </w:rPr>
-        <w:t>MVP</w:t>
-      </w:r>
-      <w:r>
-        <w:rPr>
-          <w:color w:val="A6A6A6" w:themeColor="background1" w:themeShade="A6"/>
-          <w:sz w:val="24"/>
-          <w:szCs w:val="24"/>
-        </w:rPr>
-        <w:t>: a forma eficiente de criar, validar e comercializar um novo produto ou serviço, Kindle: Amazon.com, 2020.</w:t>
-      </w:r>
-    </w:p>
-    <w:p>
-      <w:pPr>
-        <w:spacing w:after="240"/>
-        <w:rPr>
-          <w:color w:val="A6A6A6" w:themeColor="background1" w:themeShade="A6"/>
-          <w:sz w:val="24"/>
-          <w:szCs w:val="24"/>
-        </w:rPr>
-      </w:pPr>
-      <w:r>
-        <w:rPr>
-          <w:color w:val="A6A6A6" w:themeColor="background1" w:themeShade="A6"/>
-          <w:sz w:val="24"/>
-          <w:szCs w:val="24"/>
-          <w:lang w:val="en-US"/>
-        </w:rPr>
-        <w:t xml:space="preserve">RIES, E. </w:t>
-      </w:r>
-      <w:r>
-        <w:rPr>
-          <w:b/>
-          <w:bCs/>
-          <w:color w:val="A6A6A6" w:themeColor="background1" w:themeShade="A6"/>
-          <w:sz w:val="24"/>
-          <w:szCs w:val="24"/>
-          <w:lang w:val="en-US"/>
-        </w:rPr>
-        <w:t xml:space="preserve">A Startup </w:t>
-      </w:r>
-      <w:proofErr w:type="spellStart"/>
-      <w:r>
-        <w:rPr>
-          <w:b/>
-          <w:bCs/>
-          <w:color w:val="A6A6A6" w:themeColor="background1" w:themeShade="A6"/>
-          <w:sz w:val="24"/>
-          <w:szCs w:val="24"/>
-          <w:lang w:val="en-US"/>
-        </w:rPr>
-        <w:t>Enxuta</w:t>
-      </w:r>
-      <w:proofErr w:type="spellEnd"/>
-      <w:r>
-        <w:rPr>
-          <w:b/>
-          <w:bCs/>
-          <w:color w:val="A6A6A6" w:themeColor="background1" w:themeShade="A6"/>
-          <w:sz w:val="24"/>
-          <w:szCs w:val="24"/>
-          <w:lang w:val="en-US"/>
-        </w:rPr>
-        <w:t>.</w:t>
-      </w:r>
-      <w:r>
-        <w:rPr>
-          <w:color w:val="A6A6A6" w:themeColor="background1" w:themeShade="A6"/>
-          <w:sz w:val="24"/>
-          <w:szCs w:val="24"/>
-          <w:lang w:val="en-US"/>
-        </w:rPr>
-        <w:t xml:space="preserve"> </w:t>
-      </w:r>
-      <w:r>
-        <w:rPr>
-          <w:color w:val="A6A6A6" w:themeColor="background1" w:themeShade="A6"/>
-          <w:sz w:val="24"/>
-          <w:szCs w:val="24"/>
-        </w:rPr>
-        <w:t xml:space="preserve">São Paulo: Editora </w:t>
-      </w:r>
-      <w:proofErr w:type="spellStart"/>
-      <w:r>
-        <w:rPr>
-          <w:color w:val="A6A6A6" w:themeColor="background1" w:themeShade="A6"/>
-          <w:sz w:val="24"/>
-          <w:szCs w:val="24"/>
-        </w:rPr>
-        <w:t>Leya</w:t>
-      </w:r>
-      <w:proofErr w:type="spellEnd"/>
-      <w:r>
-        <w:rPr>
-          <w:color w:val="A6A6A6" w:themeColor="background1" w:themeShade="A6"/>
-          <w:sz w:val="24"/>
-          <w:szCs w:val="24"/>
-        </w:rPr>
-        <w:t>, 2019.</w:t>
-      </w:r>
-    </w:p>
-    <w:p>
-      <w:pPr>
-        <w:spacing w:after="240"/>
-        <w:rPr>
-          <w:color w:val="A6A6A6" w:themeColor="background1" w:themeShade="A6"/>
-          <w:sz w:val="24"/>
-          <w:szCs w:val="24"/>
-        </w:rPr>
-      </w:pPr>
-      <w:r>
-        <w:rPr>
-          <w:color w:val="A6A6A6" w:themeColor="background1" w:themeShade="A6"/>
-          <w:sz w:val="24"/>
-          <w:szCs w:val="24"/>
-        </w:rPr>
-        <w:lastRenderedPageBreak/>
         <w:t xml:space="preserve">SUTHERLAND, J. </w:t>
       </w:r>
       <w:r>
@@ -5804,42 +5319,85 @@
       <w:pPr>
         <w:pStyle w:val="Ttulo2"/>
         <w:ind w:left="426" w:hanging="426"/>
+      </w:pPr>
+      <w:bookmarkStart w:id="15" w:name="_Toc228442940"/>
+      <w:r>
+        <w:t>1.</w:t>
+      </w:r>
+      <w:r>
+        <w:t>9</w:t>
+      </w:r>
+      <w:r>
+        <w:t xml:space="preserve"> </w:t>
+      </w:r>
+      <w:r>
+        <w:t xml:space="preserve">Entregáveis – </w:t>
+      </w:r>
+      <w:proofErr w:type="spellStart"/>
+      <w:r>
         <w:rPr>
           <w:i/>
           <w:iCs/>
         </w:rPr>
-      </w:pPr>
-      <w:bookmarkStart w:id="17" w:name="_Toc228442941"/>
-      <w:r>
-        <w:t>1.</w:t>
-      </w:r>
-      <w:r>
-        <w:t>10</w:t>
-      </w:r>
-      <w:r>
-        <w:t xml:space="preserve"> </w:t>
-      </w:r>
-      <w:r>
-        <w:t xml:space="preserve">Retrospectiva dos </w:t>
-      </w:r>
+        <w:t>Minimum</w:t>
+      </w:r>
+      <w:proofErr w:type="spellEnd"/>
       <w:r>
         <w:rPr>
           <w:i/>
           <w:iCs/>
         </w:rPr>
-        <w:t>Sprints</w:t>
-      </w:r>
-      <w:bookmarkEnd w:id="17"/>
+        <w:t xml:space="preserve"> </w:t>
+      </w:r>
+      <w:proofErr w:type="spellStart"/>
+      <w:r>
+        <w:rPr>
+          <w:i/>
+          <w:iCs/>
+        </w:rPr>
+        <w:t>Viable</w:t>
+      </w:r>
+      <w:proofErr w:type="spellEnd"/>
+      <w:r>
+        <w:rPr>
+          <w:i/>
+          <w:iCs/>
+        </w:rPr>
+        <w:t xml:space="preserve"> </w:t>
+      </w:r>
+      <w:proofErr w:type="spellStart"/>
+      <w:r>
+        <w:rPr>
+          <w:i/>
+          <w:iCs/>
+        </w:rPr>
+        <w:t>Product</w:t>
+      </w:r>
+      <w:proofErr w:type="spellEnd"/>
+      <w:r>
+        <w:t xml:space="preserve"> (MVP)</w:t>
+      </w:r>
+      <w:bookmarkEnd w:id="15"/>
     </w:p>
     <w:p/>
     <w:p>
       <w:r>
-        <w:t>Apresentar as reflexões e revisões do projeto realizado durante o ritual de retrospectiva dos Sprints.</w:t>
+        <w:lastRenderedPageBreak/>
+        <w:t xml:space="preserve">Apresentar </w:t>
+      </w:r>
+      <w:r>
+        <w:t xml:space="preserve">as diferentes versões dos </w:t>
+      </w:r>
+      <w:proofErr w:type="spellStart"/>
+      <w:r>
+        <w:t>MVPs</w:t>
+      </w:r>
+      <w:proofErr w:type="spellEnd"/>
+      <w:r>
+        <w:t xml:space="preserve"> do produto em formato de entregáveis realizados durante as seis semanas de atividades do projeto.</w:t>
       </w:r>
     </w:p>
     <w:p/>
-    <w:p/>
-    <w:p/>
     <w:p>
       <w:pPr>
         <w:spacing w:after="240"/>
@@ -5873,7 +5431,7 @@
           <w:sz w:val="24"/>
           <w:szCs w:val="24"/>
         </w:rPr>
-        <w:t xml:space="preserve">SUTHERLAND, J. </w:t>
+        <w:t xml:space="preserve">MATSUMOTO, Mayra, </w:t>
       </w:r>
       <w:r>
         <w:rPr>
@@ -5883,6 +5441,131 @@
           <w:sz w:val="24"/>
           <w:szCs w:val="24"/>
         </w:rPr>
+        <w:t>MVP</w:t>
+      </w:r>
+      <w:r>
+        <w:rPr>
+          <w:color w:val="A6A6A6" w:themeColor="background1" w:themeShade="A6"/>
+          <w:sz w:val="24"/>
+          <w:szCs w:val="24"/>
+        </w:rPr>
+        <w:t>: a forma eficiente de criar, validar e comercializar um novo produto ou serviço, Kindle: Amazon.com, 2020.</w:t>
+      </w:r>
+    </w:p>
+    <w:p>
+      <w:pPr>
+        <w:spacing w:after="240"/>
+        <w:rPr>
+          <w:color w:val="A6A6A6" w:themeColor="background1" w:themeShade="A6"/>
+          <w:sz w:val="24"/>
+          <w:szCs w:val="24"/>
+        </w:rPr>
+      </w:pPr>
+      <w:r>
+        <w:rPr>
+          <w:color w:val="A6A6A6" w:themeColor="background1" w:themeShade="A6"/>
+          <w:sz w:val="24"/>
+          <w:szCs w:val="24"/>
+          <w:lang w:val="en-US"/>
+        </w:rPr>
+        <w:t xml:space="preserve">RIES, E. </w:t>
+      </w:r>
+      <w:r>
+        <w:rPr>
+          <w:b/>
+          <w:bCs/>
+          <w:color w:val="A6A6A6" w:themeColor="background1" w:themeShade="A6"/>
+          <w:sz w:val="24"/>
+          <w:szCs w:val="24"/>
+          <w:lang w:val="en-US"/>
+        </w:rPr>
+        <w:t xml:space="preserve">A Startup </w:t>
+      </w:r>
+      <w:proofErr w:type="spellStart"/>
+      <w:r>
+        <w:rPr>
+          <w:b/>
+          <w:bCs/>
+          <w:color w:val="A6A6A6" w:themeColor="background1" w:themeShade="A6"/>
+          <w:sz w:val="24"/>
+          <w:szCs w:val="24"/>
+          <w:lang w:val="en-US"/>
+        </w:rPr>
+        <w:t>Enxuta</w:t>
+      </w:r>
+      <w:proofErr w:type="spellEnd"/>
+      <w:r>
+        <w:rPr>
+          <w:b/>
+          <w:bCs/>
+          <w:color w:val="A6A6A6" w:themeColor="background1" w:themeShade="A6"/>
+          <w:sz w:val="24"/>
+          <w:szCs w:val="24"/>
+          <w:lang w:val="en-US"/>
+        </w:rPr>
+        <w:t>.</w:t>
+      </w:r>
+      <w:r>
+        <w:rPr>
+          <w:color w:val="A6A6A6" w:themeColor="background1" w:themeShade="A6"/>
+          <w:sz w:val="24"/>
+          <w:szCs w:val="24"/>
+          <w:lang w:val="en-US"/>
+        </w:rPr>
+        <w:t xml:space="preserve"> </w:t>
+      </w:r>
+      <w:r>
+        <w:rPr>
+          <w:color w:val="A6A6A6" w:themeColor="background1" w:themeShade="A6"/>
+          <w:sz w:val="24"/>
+          <w:szCs w:val="24"/>
+        </w:rPr>
+        <w:t xml:space="preserve">São Paulo: Editora </w:t>
+      </w:r>
+      <w:proofErr w:type="spellStart"/>
+      <w:r>
+        <w:rPr>
+          <w:color w:val="A6A6A6" w:themeColor="background1" w:themeShade="A6"/>
+          <w:sz w:val="24"/>
+          <w:szCs w:val="24"/>
+        </w:rPr>
+        <w:t>Leya</w:t>
+      </w:r>
+      <w:proofErr w:type="spellEnd"/>
+      <w:r>
+        <w:rPr>
+          <w:color w:val="A6A6A6" w:themeColor="background1" w:themeShade="A6"/>
+          <w:sz w:val="24"/>
+          <w:szCs w:val="24"/>
+        </w:rPr>
+        <w:t>, 2019.</w:t>
+      </w:r>
+    </w:p>
+    <w:p>
+      <w:pPr>
+        <w:spacing w:after="240"/>
+        <w:rPr>
+          <w:color w:val="A6A6A6" w:themeColor="background1" w:themeShade="A6"/>
+          <w:sz w:val="24"/>
+          <w:szCs w:val="24"/>
+        </w:rPr>
+      </w:pPr>
+      <w:r>
+        <w:rPr>
+          <w:color w:val="A6A6A6" w:themeColor="background1" w:themeShade="A6"/>
+          <w:sz w:val="24"/>
+          <w:szCs w:val="24"/>
+        </w:rPr>
+        <w:t xml:space="preserve">SUTHERLAND, J. </w:t>
+      </w:r>
+      <w:r>
+        <w:rPr>
+          <w:b/>
+          <w:bCs/>
+          <w:color w:val="A6A6A6" w:themeColor="background1" w:themeShade="A6"/>
+          <w:sz w:val="24"/>
+          <w:szCs w:val="24"/>
+        </w:rPr>
         <w:t>Scrum</w:t>
       </w:r>
       <w:r>
@@ -5909,7 +5592,25 @@
           <w:sz w:val="24"/>
           <w:szCs w:val="24"/>
         </w:rPr>
-        <w:t xml:space="preserve">SCRUMSTUDY, Guia SBOK: Guia para o Conhecimento em Scrum, Arizona, EUA: </w:t>
+        <w:t xml:space="preserve">SCRUMSTUDY, </w:t>
+      </w:r>
+      <w:r>
+        <w:rPr>
+          <w:b/>
+          <w:bCs/>
+          <w:color w:val="A6A6A6" w:themeColor="background1" w:themeShade="A6"/>
+          <w:sz w:val="24"/>
+          <w:szCs w:val="24"/>
+        </w:rPr>
+        <w:t>Guia SBOK: Guia para o Conhecimento em Scrum</w:t>
+      </w:r>
+      <w:r>
+        <w:rPr>
+          <w:color w:val="A6A6A6" w:themeColor="background1" w:themeShade="A6"/>
+          <w:sz w:val="24"/>
+          <w:szCs w:val="24"/>
+        </w:rPr>
+        <w:t xml:space="preserve">, Arizona, EUA: </w:t>
       </w:r>
       <w:proofErr w:type="spellStart"/>
       <w:r>
@@ -5968,34 +5669,42 @@
       <w:pPr>
         <w:pStyle w:val="Ttulo2"/>
         <w:ind w:left="426" w:hanging="426"/>
-      </w:pPr>
-      <w:bookmarkStart w:id="18" w:name="_Toc228442942"/>
-      <w:r>
-        <w:t>1.1</w:t>
-      </w:r>
-      <w:r>
-        <w:t>1</w:t>
-      </w:r>
-      <w:r>
-        <w:t xml:space="preserve"> Retrospectiva do Projeto.</w:t>
-      </w:r>
-      <w:bookmarkEnd w:id="18"/>
-    </w:p>
-    <w:p>
-      <w:r>
-        <w:t>Apresentar as reflexões e revisões do projeto realizado durante o ritual de retrospectiva do projeto.</w:t>
-      </w:r>
-    </w:p>
-    <w:p>
-      <w:pPr>
-        <w:spacing w:after="240"/>
-        <w:rPr>
-          <w:color w:val="A6A6A6" w:themeColor="background1" w:themeShade="A6"/>
-          <w:sz w:val="24"/>
-          <w:szCs w:val="24"/>
-        </w:rPr>
-      </w:pPr>
-    </w:p>
+        <w:rPr>
+          <w:i/>
+          <w:iCs/>
+        </w:rPr>
+      </w:pPr>
+      <w:bookmarkStart w:id="16" w:name="_Toc228442941"/>
+      <w:r>
+        <w:t>1.</w:t>
+      </w:r>
+      <w:r>
+        <w:t>10</w:t>
+      </w:r>
+      <w:r>
+        <w:t xml:space="preserve"> </w:t>
+      </w:r>
+      <w:r>
+        <w:t xml:space="preserve">Retrospectiva dos </w:t>
+      </w:r>
+      <w:r>
+        <w:rPr>
+          <w:i/>
+          <w:iCs/>
+        </w:rPr>
+        <w:t>Sprints</w:t>
+      </w:r>
+      <w:bookmarkEnd w:id="16"/>
+    </w:p>
+    <w:p/>
+    <w:p>
+      <w:r>
+        <w:t>Apresentar as reflexões e revisões do projeto realizado durante o ritual de retrospectiva dos Sprints.</w:t>
+      </w:r>
+    </w:p>
+    <w:p/>
+    <w:p/>
+    <w:p/>
     <w:p>
       <w:pPr>
         <w:spacing w:after="240"/>
@@ -6118,6 +5827,163 @@
         <w:t>.</w:t>
       </w:r>
     </w:p>
+    <w:p/>
+    <w:p/>
+    <w:p>
+      <w:pPr>
+        <w:pStyle w:val="Ttulo2"/>
+        <w:ind w:left="426" w:hanging="426"/>
+      </w:pPr>
+      <w:bookmarkStart w:id="17" w:name="_Toc228442942"/>
+      <w:r>
+        <w:t>1.1</w:t>
+      </w:r>
+      <w:r>
+        <w:t>1</w:t>
+      </w:r>
+      <w:r>
+        <w:t xml:space="preserve"> Retrospectiva do Projeto.</w:t>
+      </w:r>
+      <w:bookmarkEnd w:id="17"/>
+    </w:p>
+    <w:p>
+      <w:r>
+        <w:t>Apresentar as reflexões e revisões do projeto realizado durante o ritual de retrospectiva do projeto.</w:t>
+      </w:r>
+    </w:p>
+    <w:p>
+      <w:pPr>
+        <w:spacing w:after="240"/>
+        <w:rPr>
+          <w:color w:val="A6A6A6" w:themeColor="background1" w:themeShade="A6"/>
+          <w:sz w:val="24"/>
+          <w:szCs w:val="24"/>
+        </w:rPr>
+      </w:pPr>
+    </w:p>
+    <w:p>
+      <w:pPr>
+        <w:spacing w:after="240"/>
+        <w:rPr>
+          <w:color w:val="A6A6A6" w:themeColor="background1" w:themeShade="A6"/>
+          <w:sz w:val="24"/>
+          <w:szCs w:val="24"/>
+        </w:rPr>
+      </w:pPr>
+      <w:r>
+        <w:rPr>
+          <w:color w:val="A6A6A6" w:themeColor="background1" w:themeShade="A6"/>
+          <w:sz w:val="24"/>
+          <w:szCs w:val="24"/>
+        </w:rPr>
+        <w:lastRenderedPageBreak/>
+        <w:t>Sugestão de bibliografia:</w:t>
+      </w:r>
+    </w:p>
+    <w:p>
+      <w:pPr>
+        <w:spacing w:after="240"/>
+        <w:rPr>
+          <w:color w:val="A6A6A6" w:themeColor="background1" w:themeShade="A6"/>
+          <w:sz w:val="24"/>
+          <w:szCs w:val="24"/>
+        </w:rPr>
+      </w:pPr>
+      <w:r>
+        <w:rPr>
+          <w:color w:val="A6A6A6" w:themeColor="background1" w:themeShade="A6"/>
+          <w:sz w:val="24"/>
+          <w:szCs w:val="24"/>
+        </w:rPr>
+        <w:t xml:space="preserve">SUTHERLAND, J. </w:t>
+      </w:r>
+      <w:r>
+        <w:rPr>
+          <w:b/>
+          <w:bCs/>
+          <w:color w:val="A6A6A6" w:themeColor="background1" w:themeShade="A6"/>
+          <w:sz w:val="24"/>
+          <w:szCs w:val="24"/>
+        </w:rPr>
+        <w:t>Scrum</w:t>
+      </w:r>
+      <w:r>
+        <w:rPr>
+          <w:color w:val="A6A6A6" w:themeColor="background1" w:themeShade="A6"/>
+          <w:sz w:val="24"/>
+          <w:szCs w:val="24"/>
+        </w:rPr>
+        <w:t>: a arte de fazer o dobro do trabalho na metade do tempo. Rio de Janeiro: Sextante, 2019.</w:t>
+      </w:r>
+    </w:p>
+    <w:p>
+      <w:pPr>
+        <w:spacing w:after="240"/>
+        <w:rPr>
+          <w:color w:val="A6A6A6" w:themeColor="background1" w:themeShade="A6"/>
+          <w:sz w:val="24"/>
+          <w:szCs w:val="24"/>
+        </w:rPr>
+      </w:pPr>
+      <w:r>
+        <w:rPr>
+          <w:color w:val="A6A6A6" w:themeColor="background1" w:themeShade="A6"/>
+          <w:sz w:val="24"/>
+          <w:szCs w:val="24"/>
+        </w:rPr>
+        <w:t xml:space="preserve">SCRUMSTUDY, Guia SBOK: Guia para o Conhecimento em Scrum, Arizona, EUA: </w:t>
+      </w:r>
+      <w:proofErr w:type="spellStart"/>
+      <w:r>
+        <w:rPr>
+          <w:color w:val="A6A6A6" w:themeColor="background1" w:themeShade="A6"/>
+          <w:sz w:val="24"/>
+          <w:szCs w:val="24"/>
+        </w:rPr>
+        <w:t>SCRUMstudy</w:t>
+      </w:r>
+      <w:proofErr w:type="spellEnd"/>
+      <w:r>
+        <w:rPr>
+          <w:color w:val="A6A6A6" w:themeColor="background1" w:themeShade="A6"/>
+          <w:sz w:val="24"/>
+          <w:szCs w:val="24"/>
+        </w:rPr>
+        <w:t xml:space="preserve">, 2016. </w:t>
+      </w:r>
+      <w:hyperlink r:id="rId18" w:history="1">
+        <w:r>
+          <w:rPr>
+            <w:color w:val="A6A6A6" w:themeColor="background1" w:themeShade="A6"/>
+          </w:rPr>
+          <w:t>https://www.Scrumstudy.com/SBOK/SCRUMstudy-SBOK-Guide-2016-Portuguese.pdf</w:t>
+        </w:r>
+      </w:hyperlink>
+      <w:r>
+        <w:rPr>
+          <w:color w:val="A6A6A6" w:themeColor="background1" w:themeShade="A6"/>
+          <w:sz w:val="24"/>
+          <w:szCs w:val="24"/>
+        </w:rPr>
+        <w:t>. Acesso em: 08 mar. 202</w:t>
+      </w:r>
+      <w:r>
+        <w:rPr>
+          <w:color w:val="A6A6A6" w:themeColor="background1" w:themeShade="A6"/>
+          <w:sz w:val="24"/>
+          <w:szCs w:val="24"/>
+        </w:rPr>
+        <w:t>4</w:t>
+      </w:r>
+      <w:r>
+        <w:rPr>
+          <w:color w:val="A6A6A6" w:themeColor="background1" w:themeShade="A6"/>
+          <w:sz w:val="24"/>
+          <w:szCs w:val="24"/>
+        </w:rPr>
+        <w:t>.</w:t>
+      </w:r>
+    </w:p>
     <w:p>
       <w:pPr>
         <w:pStyle w:val="Ttulo1"/>
@@ -6138,14 +6004,14 @@
           <w:color w:val="000000" w:themeColor="text1"/>
         </w:rPr>
       </w:pPr>
-      <w:bookmarkStart w:id="19" w:name="_Toc228442943"/>
+      <w:bookmarkStart w:id="18" w:name="_Toc228442943"/>
       <w:r>
         <w:rPr>
           <w:color w:val="000000" w:themeColor="text1"/>
         </w:rPr>
         <w:t>Desenvolvimento Web III</w:t>
       </w:r>
-      <w:bookmarkEnd w:id="19"/>
+      <w:bookmarkEnd w:id="18"/>
     </w:p>
     <w:p>
       <w:pPr>
@@ -6185,14 +6051,14 @@
           <w:color w:val="000000" w:themeColor="text1"/>
         </w:rPr>
       </w:pPr>
-      <w:bookmarkStart w:id="20" w:name="_Toc228442944"/>
+      <w:bookmarkStart w:id="19" w:name="_Toc228442944"/>
       <w:r>
         <w:rPr>
           <w:color w:val="000000" w:themeColor="text1"/>
         </w:rPr>
         <w:t>Arquitetura Geral do Sistema</w:t>
       </w:r>
-      <w:bookmarkEnd w:id="20"/>
+      <w:bookmarkEnd w:id="19"/>
     </w:p>
     <w:p>
       <w:pPr>
@@ -6225,16 +6091,16 @@
           <w:color w:val="000000" w:themeColor="text1"/>
         </w:rPr>
       </w:pPr>
-      <w:bookmarkStart w:id="21" w:name="_be9m5qlfee2k" w:colFirst="0" w:colLast="0"/>
-      <w:bookmarkStart w:id="22" w:name="_Toc228442945"/>
+      <w:bookmarkStart w:id="20" w:name="_be9m5qlfee2k" w:colFirst="0" w:colLast="0"/>
+      <w:bookmarkStart w:id="21" w:name="_Toc228442945"/>
+      <w:bookmarkEnd w:id="20"/>
+      <w:r>
+        <w:rPr>
+          <w:color w:val="000000" w:themeColor="text1"/>
+        </w:rPr>
+        <w:t>Desenvolvimento do Site</w:t>
+      </w:r>
       <w:bookmarkEnd w:id="21"/>
-      <w:r>
-        <w:rPr>
-          <w:color w:val="000000" w:themeColor="text1"/>
-        </w:rPr>
-        <w:t>Desenvolvimento do Site</w:t>
-      </w:r>
-      <w:bookmarkEnd w:id="22"/>
     </w:p>
     <w:p>
       <w:pPr>
@@ -6277,20 +6143,20 @@
           <w:color w:val="000000" w:themeColor="text1"/>
         </w:rPr>
       </w:pPr>
-      <w:bookmarkStart w:id="23" w:name="_insc0vnn24rq" w:colFirst="0" w:colLast="0"/>
-      <w:bookmarkStart w:id="24" w:name="_9ifolvgdxmor" w:colFirst="0" w:colLast="0"/>
-      <w:bookmarkStart w:id="25" w:name="_y63ppj89aknf" w:colFirst="0" w:colLast="0"/>
-      <w:bookmarkStart w:id="26" w:name="_Toc228442946"/>
+      <w:bookmarkStart w:id="22" w:name="_insc0vnn24rq" w:colFirst="0" w:colLast="0"/>
+      <w:bookmarkStart w:id="23" w:name="_9ifolvgdxmor" w:colFirst="0" w:colLast="0"/>
+      <w:bookmarkStart w:id="24" w:name="_y63ppj89aknf" w:colFirst="0" w:colLast="0"/>
+      <w:bookmarkStart w:id="25" w:name="_Toc228442946"/>
+      <w:bookmarkEnd w:id="22"/>
       <w:bookmarkEnd w:id="23"/>
       <w:bookmarkEnd w:id="24"/>
+      <w:r>
+        <w:rPr>
+          <w:color w:val="000000" w:themeColor="text1"/>
+        </w:rPr>
+        <w:t>Desenvolvimento do Sistema</w:t>
+      </w:r>
       <w:bookmarkEnd w:id="25"/>
-      <w:r>
-        <w:rPr>
-          <w:color w:val="000000" w:themeColor="text1"/>
-        </w:rPr>
-        <w:t>Desenvolvimento do Sistema</w:t>
-      </w:r>
-      <w:bookmarkEnd w:id="26"/>
     </w:p>
     <w:p>
       <w:pPr>
@@ -6338,14 +6204,14 @@
           <w:color w:val="000000" w:themeColor="text1"/>
         </w:rPr>
       </w:pPr>
-      <w:bookmarkStart w:id="27" w:name="_Toc228442947"/>
+      <w:bookmarkStart w:id="26" w:name="_Toc228442947"/>
       <w:r>
         <w:rPr>
           <w:color w:val="000000" w:themeColor="text1"/>
         </w:rPr>
         <w:t>Tecnologias Utilizadas</w:t>
       </w:r>
-      <w:bookmarkEnd w:id="27"/>
+      <w:bookmarkEnd w:id="26"/>
     </w:p>
     <w:p>
       <w:pPr>
@@ -6371,7 +6237,7 @@
           <w:color w:val="000000" w:themeColor="text1"/>
         </w:rPr>
       </w:pPr>
-      <w:bookmarkStart w:id="28" w:name="_Toc228442948"/>
+      <w:bookmarkStart w:id="27" w:name="_Toc228442948"/>
       <w:r>
         <w:rPr>
           <w:color w:val="000000" w:themeColor="text1"/>
@@ -6399,7 +6265,7 @@
         </w:rPr>
         <w:t>Backend</w:t>
       </w:r>
-      <w:bookmarkEnd w:id="28"/>
+      <w:bookmarkEnd w:id="27"/>
       <w:proofErr w:type="spellEnd"/>
       <w:r>
         <w:rPr>
@@ -6446,7 +6312,7 @@
           <w:color w:val="000000" w:themeColor="text1"/>
         </w:rPr>
       </w:pPr>
-      <w:bookmarkStart w:id="29" w:name="_Toc228442949"/>
+      <w:bookmarkStart w:id="28" w:name="_Toc228442949"/>
       <w:proofErr w:type="spellStart"/>
       <w:r>
         <w:rPr>
@@ -6461,7 +6327,7 @@
         </w:rPr>
         <w:t xml:space="preserve"> e Hospedagem</w:t>
       </w:r>
-      <w:bookmarkEnd w:id="29"/>
+      <w:bookmarkEnd w:id="28"/>
     </w:p>
     <w:p>
       <w:r>
@@ -6485,14 +6351,14 @@
           <w:color w:val="000000" w:themeColor="text1"/>
         </w:rPr>
       </w:pPr>
-      <w:bookmarkStart w:id="30" w:name="_Toc228442950"/>
+      <w:bookmarkStart w:id="29" w:name="_Toc228442950"/>
       <w:r>
         <w:rPr>
           <w:color w:val="000000" w:themeColor="text1"/>
         </w:rPr>
         <w:t>Banco de dados Não Relacional</w:t>
       </w:r>
-      <w:bookmarkEnd w:id="30"/>
+      <w:bookmarkEnd w:id="29"/>
     </w:p>
     <w:p>
       <w:pPr>
@@ -6525,7 +6391,7 @@
           <w:color w:val="000000" w:themeColor="text1"/>
         </w:rPr>
       </w:pPr>
-      <w:bookmarkStart w:id="31" w:name="_Toc228442951"/>
+      <w:bookmarkStart w:id="30" w:name="_Toc228442951"/>
       <w:r>
         <w:rPr>
           <w:color w:val="000000" w:themeColor="text1"/>
@@ -6539,7 +6405,7 @@
         </w:rPr>
         <w:t>Collections</w:t>
       </w:r>
-      <w:bookmarkEnd w:id="31"/>
+      <w:bookmarkEnd w:id="30"/>
       <w:proofErr w:type="spellEnd"/>
     </w:p>
     <w:p>
@@ -6587,14 +6453,14 @@
           <w:color w:val="000000" w:themeColor="text1"/>
         </w:rPr>
       </w:pPr>
-      <w:bookmarkStart w:id="32" w:name="_Toc228442952"/>
+      <w:bookmarkStart w:id="31" w:name="_Toc228442952"/>
       <w:r>
         <w:rPr>
           <w:color w:val="000000" w:themeColor="text1"/>
         </w:rPr>
         <w:t>Integração com o Sistema</w:t>
       </w:r>
-      <w:bookmarkEnd w:id="32"/>
+      <w:bookmarkEnd w:id="31"/>
     </w:p>
     <w:p>
       <w:pPr>
@@ -6624,14 +6490,14 @@
           <w:color w:val="000000" w:themeColor="text1"/>
         </w:rPr>
       </w:pPr>
-      <w:bookmarkStart w:id="33" w:name="_Toc228442953"/>
+      <w:bookmarkStart w:id="32" w:name="_Toc228442953"/>
       <w:r>
         <w:rPr>
           <w:color w:val="000000" w:themeColor="text1"/>
         </w:rPr>
         <w:t>Banco de dados Relacional</w:t>
       </w:r>
-      <w:bookmarkEnd w:id="33"/>
+      <w:bookmarkEnd w:id="32"/>
     </w:p>
     <w:p>
       <w:pPr>
@@ -6657,14 +6523,14 @@
           <w:color w:val="000000" w:themeColor="text1"/>
         </w:rPr>
       </w:pPr>
-      <w:bookmarkStart w:id="34" w:name="_Toc228442954"/>
+      <w:bookmarkStart w:id="33" w:name="_Toc228442954"/>
       <w:r>
         <w:rPr>
           <w:color w:val="000000" w:themeColor="text1"/>
         </w:rPr>
         <w:t>Modelagem do Banco de Dados</w:t>
       </w:r>
-      <w:bookmarkEnd w:id="34"/>
+      <w:bookmarkEnd w:id="33"/>
     </w:p>
     <w:p>
       <w:pPr>
@@ -6697,14 +6563,14 @@
           <w:color w:val="000000" w:themeColor="text1"/>
         </w:rPr>
       </w:pPr>
-      <w:bookmarkStart w:id="35" w:name="_Toc228442955"/>
+      <w:bookmarkStart w:id="34" w:name="_Toc228442955"/>
       <w:r>
         <w:rPr>
           <w:color w:val="000000" w:themeColor="text1"/>
         </w:rPr>
         <w:t>Dicionário de dados</w:t>
       </w:r>
-      <w:bookmarkEnd w:id="35"/>
+      <w:bookmarkEnd w:id="34"/>
     </w:p>
     <w:p>
       <w:pPr>
@@ -6727,14 +6593,14 @@
           <w:color w:val="000000" w:themeColor="text1"/>
         </w:rPr>
       </w:pPr>
-      <w:bookmarkStart w:id="36" w:name="_Toc228442956"/>
+      <w:bookmarkStart w:id="35" w:name="_Toc228442956"/>
       <w:r>
         <w:rPr>
           <w:color w:val="000000" w:themeColor="text1"/>
         </w:rPr>
         <w:t>Considerações Finais</w:t>
       </w:r>
-      <w:bookmarkEnd w:id="36"/>
+      <w:bookmarkEnd w:id="35"/>
     </w:p>
     <w:p>
       <w:pPr>
@@ -6793,14 +6659,14 @@
         <w:spacing w:before="0" w:line="360" w:lineRule="auto"/>
         <w:ind w:left="720" w:hanging="720"/>
       </w:pPr>
-      <w:bookmarkStart w:id="37" w:name="_Toc228442957"/>
+      <w:bookmarkStart w:id="36" w:name="_Toc228442957"/>
       <w:r>
         <w:t>Referências</w:t>
       </w:r>
       <w:r>
         <w:t xml:space="preserve"> Bibliográficas</w:t>
       </w:r>
-      <w:bookmarkEnd w:id="37"/>
+      <w:bookmarkEnd w:id="36"/>
     </w:p>
     <w:p>
       <w:pPr>
@@ -7031,6 +6897,7 @@
           <w:sz w:val="24"/>
           <w:szCs w:val="24"/>
         </w:rPr>
+        <w:lastRenderedPageBreak/>
         <w:t xml:space="preserve">CAMARGO, R. </w:t>
       </w:r>
       <w:r>
@@ -7131,7 +6998,6 @@
           <w:sz w:val="24"/>
           <w:szCs w:val="24"/>
         </w:rPr>
-        <w:lastRenderedPageBreak/>
         <w:t xml:space="preserve">CRUZ, F. </w:t>
       </w:r>
       <w:r>
@@ -7368,6 +7234,7 @@
           <w:bCs/>
           <w:sz w:val="24"/>
           <w:szCs w:val="24"/>
+          <w:lang w:val="en-US"/>
         </w:rPr>
       </w:pPr>
       <w:r>
@@ -7397,24 +7264,9 @@
         <w:rPr>
           <w:sz w:val="24"/>
           <w:szCs w:val="24"/>
-        </w:rPr>
-        <w:t xml:space="preserve">EUA: Project Management </w:t>
-      </w:r>
-      <w:proofErr w:type="spellStart"/>
-      <w:r>
-        <w:rPr>
-          <w:sz w:val="24"/>
-          <w:szCs w:val="24"/>
-        </w:rPr>
-        <w:t>Institute</w:t>
-      </w:r>
-      <w:proofErr w:type="spellEnd"/>
-      <w:r>
-        <w:rPr>
-          <w:sz w:val="24"/>
-          <w:szCs w:val="24"/>
-        </w:rPr>
-        <w:t>, 2018.</w:t>
+          <w:lang w:val="en-US"/>
+        </w:rPr>
+        <w:t>EUA: Project Management Institute, 2018.</w:t>
       </w:r>
     </w:p>
     <w:p>
@@ -7575,7 +7427,7 @@
         </w:rPr>
         <w:t xml:space="preserve">Disponível em: </w:t>
       </w:r>
-      <w:hyperlink r:id="rId18" w:history="1">
+      <w:hyperlink r:id="rId19" w:history="1">
         <w:r>
           <w:rPr>
             <w:rStyle w:val="Hyperlink"/>
@@ -7641,7 +7493,7 @@
         </w:rPr>
         <w:t xml:space="preserve">, 2016. </w:t>
       </w:r>
-      <w:hyperlink r:id="rId19" w:history="1">
+      <w:hyperlink r:id="rId20" w:history="1">
         <w:r>
           <w:rPr>
             <w:sz w:val="24"/>
@@ -7745,11 +7597,12 @@
           <w:color w:val="FF0000"/>
         </w:rPr>
       </w:pPr>
-      <w:bookmarkStart w:id="38" w:name="_Toc228442958"/>
+      <w:bookmarkStart w:id="37" w:name="_Toc228442958"/>
       <w:r>
         <w:rPr>
           <w:color w:val="FF0000"/>
         </w:rPr>
+        <w:lastRenderedPageBreak/>
         <w:t xml:space="preserve">Anexo I - </w:t>
       </w:r>
       <w:r>
@@ -7758,7 +7611,7 @@
         </w:rPr>
         <w:t>Diário de bordo</w:t>
       </w:r>
-      <w:bookmarkEnd w:id="38"/>
+      <w:bookmarkEnd w:id="37"/>
     </w:p>
     <w:p>
       <w:pPr>
@@ -7792,15 +7645,14 @@
           <w:color w:val="FF0000"/>
         </w:rPr>
       </w:pPr>
-      <w:bookmarkStart w:id="39" w:name="_Toc228442959"/>
+      <w:bookmarkStart w:id="38" w:name="_Toc228442959"/>
       <w:r>
         <w:rPr>
           <w:color w:val="FF0000"/>
         </w:rPr>
-        <w:lastRenderedPageBreak/>
         <w:t>Anexo II – Cronograma efetivo</w:t>
       </w:r>
-      <w:bookmarkEnd w:id="39"/>
+      <w:bookmarkEnd w:id="38"/>
     </w:p>
     <w:p>
       <w:pPr>
@@ -7821,14 +7673,14 @@
           <w:color w:val="FF0000"/>
         </w:rPr>
       </w:pPr>
-      <w:bookmarkStart w:id="40" w:name="_Toc228442960"/>
+      <w:bookmarkStart w:id="39" w:name="_Toc228442960"/>
       <w:r>
         <w:rPr>
           <w:color w:val="FF0000"/>
         </w:rPr>
         <w:t>Anexo III – Evidências</w:t>
       </w:r>
-      <w:bookmarkEnd w:id="40"/>
+      <w:bookmarkEnd w:id="39"/>
     </w:p>
     <w:p>
       <w:pPr>
@@ -7850,7 +7702,7 @@
       </w:r>
     </w:p>
     <w:sectPr>
-      <w:headerReference w:type="default" r:id="rId20"/>
+      <w:headerReference w:type="default" r:id="rId21"/>
       <w:pgSz w:w="11909" w:h="16834"/>
       <w:pgMar w:top="1701" w:right="1134" w:bottom="1134" w:left="1701" w:header="720" w:footer="720" w:gutter="0"/>
       <w:pgNumType w:start="1"/>
@@ -10052,15 +9904,18 @@
     <w:rsid w:val="00355901"/>
     <w:rsid w:val="003C1C9D"/>
     <w:rsid w:val="004C356F"/>
+    <w:rsid w:val="005B0420"/>
     <w:rsid w:val="00807BE6"/>
     <w:rsid w:val="009C592D"/>
     <w:rsid w:val="00B06368"/>
+    <w:rsid w:val="00B43497"/>
     <w:rsid w:val="00B855D3"/>
     <w:rsid w:val="00CA365F"/>
     <w:rsid w:val="00CE18D8"/>
     <w:rsid w:val="00EC14D6"/>
     <w:rsid w:val="00ED4B33"/>
     <w:rsid w:val="00F7551A"/>
+    <w:rsid w:val="00FD0FDD"/>
   </w:rsids>
   <m:mathPr>
     <m:mathFont m:val="Cambria Math"/>
@@ -10884,15 +10739,6 @@
 </file>
 
 <file path=customXml/item1.xml><?xml version="1.0" encoding="utf-8"?>
-<?mso-contentType ?>
-<FormTemplates xmlns="http://schemas.microsoft.com/sharepoint/v3/contenttype/forms">
-  <Display>DocumentLibraryForm</Display>
-  <Edit>DocumentLibraryForm</Edit>
-  <New>DocumentLibraryForm</New>
-</FormTemplates>
-</file>
-
-<file path=customXml/item2.xml><?xml version="1.0" encoding="utf-8"?>
 <ct:contentTypeSchema xmlns:ct="http://schemas.microsoft.com/office/2006/metadata/contentType" xmlns:ma="http://schemas.microsoft.com/office/2006/metadata/properties/metaAttributes" ct:_="" ma:_="" ma:contentTypeName="Documento" ma:contentTypeID="0x0101005F431444096C0E4181EE6841EAE19542" ma:contentTypeVersion="12" ma:contentTypeDescription="Crie um novo documento." ma:contentTypeScope="" ma:versionID="503bdd1a9f63b8253f40292f1dd1451b">
   <xsd:schema xmlns:xsd="http://www.w3.org/2001/XMLSchema" xmlns:xs="http://www.w3.org/2001/XMLSchema" xmlns:p="http://schemas.microsoft.com/office/2006/metadata/properties" xmlns:ns2="c0f35838-16df-4f4e-bd7f-2b54a1c7d614" xmlns:ns3="895e7052-72ef-4766-88c1-3310861ca215" targetNamespace="http://schemas.microsoft.com/office/2006/metadata/properties" ma:root="true" ma:fieldsID="1e3c09c50a731ad849df98dfe5a8e8a5" ns2:_="" ns3:_="">
     <xsd:import namespace="c0f35838-16df-4f4e-bd7f-2b54a1c7d614"/>
@@ -11085,19 +10931,20 @@
 </ct:contentTypeSchema>
 </file>
 
+<file path=customXml/item2.xml><?xml version="1.0" encoding="utf-8"?>
+<?mso-contentType ?>
+<FormTemplates xmlns="http://schemas.microsoft.com/sharepoint/v3/contenttype/forms">
+  <Display>DocumentLibraryForm</Display>
+  <Edit>DocumentLibraryForm</Edit>
+  <New>DocumentLibraryForm</New>
+</FormTemplates>
+</file>
+
 <file path=customXml/item3.xml><?xml version="1.0" encoding="utf-8"?>
 <b:Sources xmlns:b="http://schemas.openxmlformats.org/officeDocument/2006/bibliography" xmlns="http://schemas.openxmlformats.org/officeDocument/2006/bibliography" SelectedStyle="\APASixthEditionOfficeOnline.xsl" StyleName="APA" Version="6"/>
 </file>
 
 <file path=customXml/itemProps1.xml><?xml version="1.0" encoding="utf-8"?>
-<ds:datastoreItem xmlns:ds="http://schemas.openxmlformats.org/officeDocument/2006/customXml" ds:itemID="{0B008465-F6D3-48FC-99F7-E8EBF86DF9F6}">
-  <ds:schemaRefs>
-    <ds:schemaRef ds:uri="http://schemas.microsoft.com/sharepoint/v3/contenttype/forms"/>
-  </ds:schemaRefs>
-</ds:datastoreItem>
-</file>
-
-<file path=customXml/itemProps2.xml><?xml version="1.0" encoding="utf-8"?>
 <ds:datastoreItem xmlns:ds="http://schemas.openxmlformats.org/officeDocument/2006/customXml" ds:itemID="{403CE56D-29DD-463B-8F5F-C2550CBBAA05}">
   <ds:schemaRefs>
     <ds:schemaRef ds:uri="http://schemas.microsoft.com/office/2006/metadata/contentType"/>
@@ -11116,6 +10963,14 @@
 </ds:datastoreItem>
 </file>
 
+<file path=customXml/itemProps2.xml><?xml version="1.0" encoding="utf-8"?>
+<ds:datastoreItem xmlns:ds="http://schemas.openxmlformats.org/officeDocument/2006/customXml" ds:itemID="{0B008465-F6D3-48FC-99F7-E8EBF86DF9F6}">
+  <ds:schemaRefs>
+    <ds:schemaRef ds:uri="http://schemas.microsoft.com/sharepoint/v3/contenttype/forms"/>
+  </ds:schemaRefs>
+</ds:datastoreItem>
+</file>
+
 <file path=customXml/itemProps3.xml><?xml version="1.0" encoding="utf-8"?>
 <ds:datastoreItem xmlns:ds="http://schemas.openxmlformats.org/officeDocument/2006/customXml" ds:itemID="{6F0C982A-CA15-4101-95E9-E83C40D43193}">
   <ds:schemaRefs>

</xml_diff>